<commit_message>
docs: elevate Metodología Protocolo Individual 2 to version 5.0
</commit_message>
<xml_diff>
--- a/Metodología de la Educación a Distancia/Entregables/Protocolo Individual 2 - Metodologia.docx
+++ b/Metodología de la Educación a Distancia/Entregables/Protocolo Individual 2 - Metodologia.docx
@@ -559,6 +559,35 @@
                 <w:b/>
                 <w:sz w:val="21"/>
               </w:rPr>
+              <w:t>Crédito académico y dedicación temporal:</w:t>
+            </w:r>
+            <w:r>
+              <w:rPr>
+                <w:rFonts w:ascii="Arial" w:hAnsi="Arial"/>
+                <w:sz w:val="21"/>
+              </w:rPr>
+              <w:t xml:space="preserve"> Unidad de medida del trabajo del estudiante que equivale formalmente a 48 horas de actividad académica por semestre. En la modalidad a distancia, cada crédito exige articular las horas de tutoría presencial de los sábados con un promedio mínimo de dos a tres horas semanales de estudio independiente no negociables.</w:t>
+            </w:r>
+          </w:p>
+          <w:p>
+            <w:pPr>
+              <w:spacing w:after="60"/>
+              <w:ind w:left="288"/>
+            </w:pPr>
+            <w:r>
+              <w:rPr>
+                <w:rFonts w:ascii="Arial" w:hAnsi="Arial"/>
+                <w:b/>
+                <w:sz w:val="21"/>
+              </w:rPr>
+              <w:t xml:space="preserve">• </w:t>
+            </w:r>
+            <w:r>
+              <w:rPr>
+                <w:rFonts w:ascii="Arial" w:hAnsi="Arial"/>
+                <w:b/>
+                <w:sz w:val="21"/>
+              </w:rPr>
               <w:t>Autorregulación del tiempo:</w:t>
             </w:r>
             <w:r>
@@ -566,7 +595,7 @@
                 <w:rFonts w:ascii="Arial" w:hAnsi="Arial"/>
                 <w:sz w:val="21"/>
               </w:rPr>
-              <w:t xml:space="preserve"> Capacidad del estudiante para estructurar un cronograma de trabajo no negociable basado en el volumen de créditos de cada asignatura, asegurando dedicación semanal continua sin depender de recordatorios externos.</w:t>
+              <w:t xml:space="preserve"> Capacidad del estudiante para estructurar un cronograma de trabajo estricto y adaptativo basado en los créditos de sus asignaturas, garantizando constancia sin depender de órdenes o supervisión externa.</w:t>
             </w:r>
           </w:p>
         </w:tc>
@@ -615,7 +644,7 @@
                 <w:rFonts w:ascii="Arial" w:hAnsi="Arial"/>
                 <w:sz w:val="21"/>
               </w:rPr>
-              <w:t>Como explica el docente e investigador Amaury Lora Sfer (2014), este proceso abarca tres momentos fundamentales que operan como una espiral ascendente. El primer momento corresponde al estudio individual. No se trata de un aislamiento solitario, sino de un trabajo individual en red donde el estudiante lee los módulos, consulta fuentes científicas, toma notas y elabora su protocolo individual. El segundo momento ocurre en los grupos colaborativos (CIPAS), donde contrastamos nuestras ideas, aclaramos dudas con los compañeros y redactamos el protocolo colaborativo. El autor subraya una premisa tajante: el trabajo en equipo fracasa por completo si no está precedido de un estudio individual serio. La colaboración no reemplaza la lectura personal; la complementa.</w:t>
+              <w:t>Como explica el docente e investigador Amaury Lora Sfer (2014), este proceso abarca tres momentos fundamentales que operan como una espiral dialéctica y ascendente. El primer momento corresponde al estudio individual. No se trata de un aislamiento solitario, sino de un trabajo individual en red donde el estudiante lee los módulos, consulta fuentes científicas, toma notas y elabora su protocolo individual. El segundo momento ocurre en los grupos colaborativos (CIPAS), donde contrastamos nuestras ideas, aclaramos dudas con los compañeros y redactamos el protocolo colaborativo. El autor subraya una premisa tajante: el trabajo en equipo fracasa por completo si no está precedido de un estudio individual serio. La colaboración no reemplaza la lectura personal; la complementa.</w:t>
             </w:r>
           </w:p>
           <w:p>
@@ -627,7 +656,7 @@
                 <w:rFonts w:ascii="Arial" w:hAnsi="Arial"/>
                 <w:sz w:val="21"/>
               </w:rPr>
-              <w:t>El tercer momento se concreta en la tutoría con el grupo amplio y el profesor. Aquí el tutor no viene a dictar una clase tradicional desde cero, sino a liderar la co-validación de lo trabajado en las etapas previas. A través de sucesivas síntesis y debates, las dudas complejas se resuelven y el conocimiento queda formalmente validado. La lectura concluye enfatizando que la flexibilidad horaria de la educación a distancia no hace milagros por sí sola: sin una planificación estricta del tiempo acorde a los créditos académicos, motivación intrínseca y habilidades lectoescritoras bien desarrolladas, es imposible alcanzar el éxito universitario.</w:t>
+              <w:t>El tercer momento se concreta en la tutoría con el grupo amplio y el profesor. Aquí el tutor mediador no viene a dictar una clase tradicional desde cero, sino a liderar la co-validación de lo trabajado en las etapas previas. A través de sucesivas síntesis y debates, las dudas complejas se resuelven y el saber queda formalmente validado. La lectura concluye con una advertencia lapidaria y realista del autor: la flexibilidad de la educación a distancia es una ventaja para organizar la rutina diaria, pero no hace milagros por sí sola, porque «quien no estudia, no aprende». Sin una planificación rigurosa calculada según los créditos académicos, autodisciplina y competencias lectoescritoras bien desarrolladas, es imposible alcanzar el éxito universitario.</w:t>
             </w:r>
           </w:p>
         </w:tc>
@@ -736,7 +765,7 @@
                 <w:rFonts w:ascii="Arial" w:hAnsi="Arial"/>
                 <w:sz w:val="21"/>
               </w:rPr>
-              <w:t>En la práctica cotidiana, uno de los desafíos más frecuentes es garantizar que todos los miembros del CIPAS lleguen al segundo momento con la lectura individual completada y el protocolo individual elaborado, ya que la asimetría en la preparación previa debilita la discusión grupal y dificulta la redacción del protocolo colaborativo.</w:t>
+              <w:t>En la práctica cotidiana de los grupos CIPAS, el vicio más común y destructivo es caer en el «reparto de pedazos»: asignarle una pregunta o una sección a cada integrante y pegar todo al final como una colcha de retazos, sin que nadie lea ni debata lo que escribió el otro. Esta mala práctica destruye por completo el segundo momento del aprendizaje y anula la co-validación de la que habla el profesor Lora Sfer, ya que no hay debate real ni enriquecimiento mutuo.</w:t>
             </w:r>
           </w:p>
           <w:p>
@@ -748,7 +777,7 @@
                 <w:rFonts w:ascii="Arial" w:hAnsi="Arial"/>
                 <w:sz w:val="21"/>
               </w:rPr>
-              <w:t>Como recomendación, sugiero que los equipos CIPAS establezcan pactos de trabajo con horarios fijos de debate intermedio antes de las tutorías presenciales, utilizando herramientas colaborativas como Google Docs y repositorios compartidos, de modo que la tutoría del sábado se aproveche al 100% en preguntas de fondo y validación de casos prácticos.</w:t>
+              <w:t>Como recomendación concreta, propongo que dentro de los equipos de trabajo se establezca como regla innegociable que ningún integrante pueda participar en la redacción del protocolo colaborativo si antes no ha presentado su protocolo individual ya terminado. Asimismo, sugiero que los debates se realicen sobre un documento compartido en Google Docs con control de cambios, revisando párrafo por párrafo hasta llegar a un verdadero consenso grupal antes de asistir a la tutoría presencial del sábado.</w:t>
             </w:r>
           </w:p>
         </w:tc>

</xml_diff>

<commit_message>
docs: adjust tone to authentic student voice and remove trailing blank page
</commit_message>
<xml_diff>
--- a/Metodología de la Educación a Distancia/Entregables/Protocolo Individual 2 - Metodologia.docx
+++ b/Metodología de la Educación a Distancia/Entregables/Protocolo Individual 2 - Metodologia.docx
@@ -2,79 +2,6 @@
 <file path=word/document.xml><?xml version="1.0" encoding="utf-8"?>
 <w:document xmlns:wpc="http://schemas.microsoft.com/office/word/2010/wordprocessingCanvas" xmlns:mc="http://schemas.openxmlformats.org/markup-compatibility/2006" xmlns:o="urn:schemas-microsoft-com:office:office" xmlns:r="http://schemas.openxmlformats.org/officeDocument/2006/relationships" xmlns:m="http://schemas.openxmlformats.org/officeDocument/2006/math" xmlns:v="urn:schemas-microsoft-com:vml" xmlns:wp="http://schemas.openxmlformats.org/drawingml/2006/wordprocessingDrawing" xmlns:w="http://schemas.openxmlformats.org/wordprocessingml/2006/main" xmlns:wpg="http://schemas.microsoft.com/office/word/2010/wordprocessingGroup" xmlns:wpi="http://schemas.microsoft.com/office/word/2010/wordprocessingInk" xmlns:a="http://schemas.openxmlformats.org/drawingml/2006/main" xmlns:wne="http://schemas.microsoft.com/office/word/2006/wordml" xmlns:wps="http://schemas.microsoft.com/office/word/2010/wordprocessingShape" xmlns:w10="urn:schemas-microsoft-com:office:word" xmlns:wp14="http://schemas.microsoft.com/office/word/2010/wordprocessingDrawing" xmlns:w14="http://schemas.microsoft.com/office/word/2010/wordml" xmlns:w15="http://schemas.microsoft.com/office/word/2012/wordml" xmlns:w16cex="http://schemas.microsoft.com/office/word/2018/wordml/cex" xmlns:w16cid="http://schemas.microsoft.com/office/word/2016/wordml/cid" xmlns:w16="http://schemas.microsoft.com/office/word/2018/wordml" xmlns:w16sdtdh="http://schemas.microsoft.com/office/word/2020/wordml/sdtdatahash" xmlns:w16se="http://schemas.microsoft.com/office/word/2015/wordml/symex" mc:Ignorable="w14 w15 w16se w16cid w16 w16cex w16sdtdh wp14">
   <w:body>
-    <w:p>
-      <w:pPr>
-        <w:keepNext w:val="false"/>
-        <w:keepLines w:val="false"/>
-        <w:pageBreakBefore w:val="false"/>
-        <w:widowControl w:val="false"/>
-        <w:pBdr>
-          <w:top w:val="none" w:color="000000" w:sz="0" w:space="0"/>
-          <w:left w:val="none" w:color="000000" w:sz="0" w:space="0"/>
-          <w:bottom w:val="none" w:color="000000" w:sz="0" w:space="0"/>
-          <w:right w:val="none" w:color="000000" w:sz="0" w:space="0"/>
-          <w:between w:val="none" w:color="000000" w:sz="0" w:space="0"/>
-        </w:pBdr>
-        <w:shd w:val="clear" w:color="auto" w:fill="auto"/>
-        <w:spacing w:after="0" w:before="0" w:line="276" w:lineRule="auto"/>
-        <w:ind w:right="0" w:firstLine="0" w:left="0"/>
-        <w:jc w:val="left"/>
-        <w:rPr>
-          <w:rFonts w:ascii="Arial" w:hAnsi="Arial" w:eastAsia="Arial" w:cs="Arial"/>
-          <w:b w:val="0"/>
-          <w:bCs w:val="0"/>
-          <w:i w:val="0"/>
-          <w:iCs w:val="0"/>
-          <w:smallCaps w:val="0"/>
-          <w:strike w:val="0"/>
-          <w:color w:val="000000"/>
-          <w:sz w:val="22"/>
-          <w:szCs w:val="22"/>
-          <w:u w:val="none"/>
-          <w:shd w:val="clear" w:color="auto" w:fill="auto"/>
-          <w:vertAlign w:val="baseline"/>
-        </w:rPr>
-      </w:pPr>
-      <w:r>
-        <w:rPr>
-          <w:rtl w:val="0"/>
-        </w:rPr>
-      </w:r>
-      <w:r>
-        <w:rPr>
-          <w:rFonts w:ascii="Arial" w:hAnsi="Arial" w:eastAsia="Arial" w:cs="Arial"/>
-          <w:b w:val="0"/>
-          <w:bCs w:val="0"/>
-          <w:i w:val="0"/>
-          <w:iCs w:val="0"/>
-          <w:smallCaps w:val="0"/>
-          <w:strike w:val="0"/>
-          <w:color w:val="000000"/>
-          <w:sz w:val="22"/>
-          <w:szCs w:val="22"/>
-          <w:u w:val="none"/>
-          <w:shd w:val="clear" w:color="auto" w:fill="auto"/>
-          <w:vertAlign w:val="baseline"/>
-        </w:rPr>
-      </w:r>
-      <w:r>
-        <w:rPr>
-          <w:rFonts w:ascii="Arial" w:hAnsi="Arial" w:eastAsia="Arial" w:cs="Arial"/>
-          <w:b w:val="0"/>
-          <w:bCs w:val="0"/>
-          <w:i w:val="0"/>
-          <w:iCs w:val="0"/>
-          <w:smallCaps w:val="0"/>
-          <w:strike w:val="0"/>
-          <w:color w:val="000000"/>
-          <w:sz w:val="22"/>
-          <w:szCs w:val="22"/>
-          <w:u w:val="none"/>
-          <w:shd w:val="clear" w:color="auto" w:fill="auto"/>
-          <w:vertAlign w:val="baseline"/>
-        </w:rPr>
-      </w:r>
-    </w:p>
     <w:tbl>
       <w:tblPr>
         <w:tblStyle w:val="948"/>
@@ -108,14 +35,14 @@
           </w:tcPr>
           <w:p>
             <w:pPr>
-              <w:spacing w:after="80"/>
+              <w:spacing w:after="60"/>
             </w:pPr>
             <w:r/>
             <w:r>
               <w:rPr>
                 <w:rFonts w:ascii="Arial" w:hAnsi="Arial"/>
                 <w:b/>
-                <w:sz w:val="26"/>
+                <w:sz w:val="24"/>
               </w:rPr>
               <w:t>Protocolo individual — Unidad 2: Momentos de Aprendizaje Metodología a Distancia</w:t>
             </w:r>
@@ -128,14 +55,14 @@
               <w:rPr>
                 <w:rFonts w:ascii="Arial" w:hAnsi="Arial"/>
                 <w:b/>
-                <w:sz w:val="22"/>
+                <w:sz w:val="21"/>
               </w:rPr>
               <w:t xml:space="preserve">Asignatura: </w:t>
             </w:r>
             <w:r>
               <w:rPr>
                 <w:rFonts w:ascii="Arial" w:hAnsi="Arial"/>
-                <w:sz w:val="22"/>
+                <w:sz w:val="21"/>
               </w:rPr>
               <w:t>Metodologías y Estrategias de la Educación a Distancia (MEAD)</w:t>
             </w:r>
@@ -148,34 +75,34 @@
               <w:rPr>
                 <w:rFonts w:ascii="Arial" w:hAnsi="Arial"/>
                 <w:b/>
-                <w:sz w:val="22"/>
+                <w:sz w:val="21"/>
               </w:rPr>
               <w:t xml:space="preserve">Nombre: </w:t>
             </w:r>
             <w:r>
               <w:rPr>
                 <w:rFonts w:ascii="Arial" w:hAnsi="Arial"/>
-                <w:sz w:val="22"/>
+                <w:sz w:val="21"/>
               </w:rPr>
               <w:t>Esteban David Marrugo Jassir</w:t>
             </w:r>
           </w:p>
           <w:p>
             <w:pPr>
-              <w:spacing w:after="80"/>
+              <w:spacing w:after="60"/>
             </w:pPr>
             <w:r>
               <w:rPr>
                 <w:rFonts w:ascii="Arial" w:hAnsi="Arial"/>
                 <w:b/>
-                <w:sz w:val="22"/>
+                <w:sz w:val="21"/>
               </w:rPr>
               <w:t xml:space="preserve">Programa: </w:t>
             </w:r>
             <w:r>
               <w:rPr>
                 <w:rFonts w:ascii="Arial" w:hAnsi="Arial"/>
-                <w:sz w:val="22"/>
+                <w:sz w:val="21"/>
               </w:rPr>
               <w:t>Ingeniería de Software</w:t>
               <w:br/>
@@ -184,14 +111,14 @@
               <w:rPr>
                 <w:rFonts w:ascii="Arial" w:hAnsi="Arial"/>
                 <w:b/>
-                <w:sz w:val="22"/>
+                <w:sz w:val="21"/>
               </w:rPr>
               <w:t xml:space="preserve">Código: </w:t>
             </w:r>
             <w:r>
               <w:rPr>
                 <w:rFonts w:ascii="Arial" w:hAnsi="Arial"/>
-                <w:sz w:val="22"/>
+                <w:sz w:val="21"/>
               </w:rPr>
               <w:t>7502620036</w:t>
               <w:br/>
@@ -200,14 +127,14 @@
               <w:rPr>
                 <w:rFonts w:ascii="Arial" w:hAnsi="Arial"/>
                 <w:b/>
-                <w:sz w:val="22"/>
+                <w:sz w:val="21"/>
               </w:rPr>
               <w:t xml:space="preserve">Semestre: </w:t>
             </w:r>
             <w:r>
               <w:rPr>
                 <w:rFonts w:ascii="Arial" w:hAnsi="Arial"/>
-                <w:sz w:val="22"/>
+                <w:sz w:val="21"/>
               </w:rPr>
               <w:t>1</w:t>
             </w:r>
@@ -224,7 +151,7 @@
           </w:tcPr>
           <w:p>
             <w:pPr>
-              <w:spacing w:after="80"/>
+              <w:spacing w:after="60"/>
             </w:pPr>
             <w:r/>
             <w:r>
@@ -238,14 +165,14 @@
           </w:p>
           <w:p>
             <w:pPr>
-              <w:spacing w:after="80" w:line="276" w:lineRule="auto"/>
+              <w:spacing w:after="60" w:line="276" w:lineRule="auto"/>
             </w:pPr>
             <w:r>
               <w:rPr>
                 <w:rFonts w:ascii="Arial" w:hAnsi="Arial"/>
-                <w:sz w:val="21"/>
+                <w:sz w:val="20"/>
               </w:rPr>
-              <w:t>Lectura analítica e interpretación crítica del Módulo de la Unidad 2, centrado en «Los Tres Momentos del Aprendizaje en la Metodología a Distancia», su secuencia dialéctica de co-validación del conocimiento, la gestión autónoma del tiempo y el desarrollo de habilidades metacognitivas en la Universidad de Cartagena.</w:t>
+              <w:t>Revisión y análisis del módulo de la Unidad 2 sobre los tres momentos del aprendizaje a distancia (estudio individual, trabajo en CIPAS y tutoría presencial), evaluando cómo se organiza el tiempo de estudio y cómo se valida el conocimiento a lo largo del semestre.</w:t>
             </w:r>
           </w:p>
         </w:tc>
@@ -260,7 +187,7 @@
           </w:tcPr>
           <w:p>
             <w:pPr>
-              <w:spacing w:after="80"/>
+              <w:spacing w:after="60"/>
             </w:pPr>
             <w:r/>
             <w:r>
@@ -274,14 +201,14 @@
           </w:p>
           <w:p>
             <w:pPr>
-              <w:spacing w:after="80" w:line="276" w:lineRule="auto"/>
+              <w:spacing w:after="60" w:line="276" w:lineRule="auto"/>
             </w:pPr>
             <w:r>
               <w:rPr>
                 <w:rFonts w:ascii="Arial" w:hAnsi="Arial"/>
-                <w:sz w:val="21"/>
+                <w:sz w:val="20"/>
               </w:rPr>
-              <w:t>Momentos del aprendizaje, Amaury Lora Sfer, Ciclos tutoriales, Co-validación dialéctica, Aprendizaje autónomo en red, Grupos colaborativos CIPAS, Síntesis sucesivas, Estrategias metacognitivas, Autorregulación del tiempo, Créditos académicos.</w:t>
+              <w:t>Momentos del aprendizaje, Amaury Lora Sfer, Trabajo en red, CIPAS, Tutoría de co-validación, Aprendizaje autónomo, Crédito académico, Gestión del tiempo, Metacognición, Síntesis tutorial.</w:t>
             </w:r>
           </w:p>
         </w:tc>
@@ -296,7 +223,7 @@
           </w:tcPr>
           <w:p>
             <w:pPr>
-              <w:spacing w:after="80"/>
+              <w:spacing w:after="60"/>
             </w:pPr>
             <w:r/>
             <w:r>
@@ -310,56 +237,77 @@
           </w:p>
           <w:p>
             <w:pPr>
-              <w:spacing w:after="60"/>
-              <w:ind w:left="288"/>
+              <w:spacing w:after="40"/>
+              <w:ind w:left="216"/>
             </w:pPr>
             <w:r>
               <w:rPr>
                 <w:rFonts w:ascii="Arial" w:hAnsi="Arial"/>
                 <w:b/>
-                <w:sz w:val="21"/>
+                <w:sz w:val="20"/>
               </w:rPr>
               <w:t xml:space="preserve">• </w:t>
             </w:r>
             <w:r>
               <w:rPr>
                 <w:rFonts w:ascii="Arial" w:hAnsi="Arial"/>
-                <w:sz w:val="21"/>
+                <w:sz w:val="20"/>
               </w:rPr>
-              <w:t>Comprender la estructura y articulación de los tres momentos del aprendizaje en la educación a distancia mediatizada como niveles ascendentes de validación del saber.</w:t>
+              <w:t>Entender cómo se conectan los tres momentos del aprendizaje y por qué ninguno funciona si se salta el anterior.</w:t>
             </w:r>
           </w:p>
           <w:p>
             <w:pPr>
-              <w:spacing w:after="60"/>
-              <w:ind w:left="288"/>
+              <w:spacing w:after="40"/>
+              <w:ind w:left="216"/>
             </w:pPr>
             <w:r>
               <w:rPr>
                 <w:rFonts w:ascii="Arial" w:hAnsi="Arial"/>
                 <w:b/>
-                <w:sz w:val="21"/>
+                <w:sz w:val="20"/>
               </w:rPr>
               <w:t xml:space="preserve">• </w:t>
             </w:r>
             <w:r>
               <w:rPr>
                 <w:rFonts w:ascii="Arial" w:hAnsi="Arial"/>
-                <w:sz w:val="21"/>
+                <w:sz w:val="20"/>
               </w:rPr>
-              <w:t>Analizar el carácter dialéctico del proceso formativo, reconociendo que el trabajo colaborativo solo es productivo cuando viene precedido de un compromiso individual riguroso.</w:t>
+              <w:t>Reconocer que el CIPAS no es para dividirse tareas, sino para discutir lo que cada uno ya estudió por su cuenta.</w:t>
             </w:r>
           </w:p>
           <w:p>
             <w:pPr>
-              <w:spacing w:after="60"/>
-              <w:ind w:left="288"/>
+              <w:spacing w:after="40"/>
+              <w:ind w:left="216"/>
             </w:pPr>
             <w:r>
               <w:rPr>
                 <w:rFonts w:ascii="Arial" w:hAnsi="Arial"/>
                 <w:b/>
-                <w:sz w:val="21"/>
+                <w:sz w:val="20"/>
+              </w:rPr>
+              <w:t xml:space="preserve">• </w:t>
+            </w:r>
+            <w:r>
+              <w:rPr>
+                <w:rFonts w:ascii="Arial" w:hAnsi="Arial"/>
+                <w:sz w:val="20"/>
+              </w:rPr>
+              <w:t>Aprender a calcular el tiempo real de estudio independiente según los créditos de cada materia.</w:t>
+            </w:r>
+          </w:p>
+          <w:p>
+            <w:pPr>
+              <w:spacing w:after="40"/>
+              <w:ind w:left="216"/>
+            </w:pPr>
+            <w:r>
+              <w:rPr>
+                <w:rFonts w:ascii="Arial" w:hAnsi="Arial"/>
+                <w:b/>
+                <w:sz w:val="20"/>
               </w:rPr>
               <w:t xml:space="preserve">• </w:t>
             </w:r>
@@ -367,37 +315,16 @@
               <w:rPr>
                 <w:rFonts w:ascii="Arial" w:hAnsi="Arial"/>
                 <w:b/>
-                <w:sz w:val="21"/>
+                <w:sz w:val="20"/>
               </w:rPr>
-              <w:t>Identificar las condiciones indispensables para el autoaprendizaje exitoso:</w:t>
+              <w:t>Tener claro el papel del tutor los sábados:</w:t>
             </w:r>
             <w:r>
               <w:rPr>
                 <w:rFonts w:ascii="Arial" w:hAnsi="Arial"/>
-                <w:sz w:val="21"/>
+                <w:sz w:val="20"/>
               </w:rPr>
-              <w:t xml:space="preserve"> manejo eficiente del tiempo de acuerdo con los créditos académicos y dominio de estrategias cognitivas y metacognitivas.</w:t>
-            </w:r>
-          </w:p>
-          <w:p>
-            <w:pPr>
-              <w:spacing w:after="60"/>
-              <w:ind w:left="288"/>
-            </w:pPr>
-            <w:r>
-              <w:rPr>
-                <w:rFonts w:ascii="Arial" w:hAnsi="Arial"/>
-                <w:b/>
-                <w:sz w:val="21"/>
-              </w:rPr>
-              <w:t xml:space="preserve">• </w:t>
-            </w:r>
-            <w:r>
-              <w:rPr>
-                <w:rFonts w:ascii="Arial" w:hAnsi="Arial"/>
-                <w:sz w:val="21"/>
-              </w:rPr>
-              <w:t>Reconocer el papel de las tutorías de los sábados no como clases magistrales convencionales, sino como espacios de co-validación y síntesis cualificada con el tutor mediador.</w:t>
+              <w:t xml:space="preserve"> resolver dudas de fondo y validar conceptos, no dar una clase magistral desde cero.</w:t>
             </w:r>
           </w:p>
         </w:tc>
@@ -412,7 +339,7 @@
           </w:tcPr>
           <w:p>
             <w:pPr>
-              <w:spacing w:after="80"/>
+              <w:spacing w:after="60"/>
             </w:pPr>
             <w:r/>
             <w:r>
@@ -426,14 +353,14 @@
           </w:p>
           <w:p>
             <w:pPr>
-              <w:spacing w:after="60"/>
-              <w:ind w:left="288"/>
+              <w:spacing w:after="40"/>
+              <w:ind w:left="216"/>
             </w:pPr>
             <w:r>
               <w:rPr>
                 <w:rFonts w:ascii="Arial" w:hAnsi="Arial"/>
                 <w:b/>
-                <w:sz w:val="21"/>
+                <w:sz w:val="20"/>
               </w:rPr>
               <w:t xml:space="preserve">• </w:t>
             </w:r>
@@ -441,28 +368,28 @@
               <w:rPr>
                 <w:rFonts w:ascii="Arial" w:hAnsi="Arial"/>
                 <w:b/>
-                <w:sz w:val="21"/>
+                <w:sz w:val="20"/>
               </w:rPr>
               <w:t>Momentos del aprendizaje:</w:t>
             </w:r>
             <w:r>
               <w:rPr>
                 <w:rFonts w:ascii="Arial" w:hAnsi="Arial"/>
-                <w:sz w:val="21"/>
+                <w:sz w:val="20"/>
               </w:rPr>
-              <w:t xml:space="preserve"> Secuencia pedagógica estructurada que articula tres fases continuas e interdependientes (estudio individual autónomo, discusión colaborativa en CIPAS y tutoría sincrónica o presencial), diseñada para garantizar niveles crecientes de profundidad y calidad en el aprendizaje.</w:t>
+              <w:t xml:space="preserve"> Las tres etapas que estructuran el estudio a distancia en la UDC: primero el trabajo individual, luego el debate en equipo (CIPAS) y finalmente la tutoría con el profesor.</w:t>
             </w:r>
           </w:p>
           <w:p>
             <w:pPr>
-              <w:spacing w:after="60"/>
-              <w:ind w:left="288"/>
+              <w:spacing w:after="40"/>
+              <w:ind w:left="216"/>
             </w:pPr>
             <w:r>
               <w:rPr>
                 <w:rFonts w:ascii="Arial" w:hAnsi="Arial"/>
                 <w:b/>
-                <w:sz w:val="21"/>
+                <w:sz w:val="20"/>
               </w:rPr>
               <w:t xml:space="preserve">• </w:t>
             </w:r>
@@ -470,28 +397,28 @@
               <w:rPr>
                 <w:rFonts w:ascii="Arial" w:hAnsi="Arial"/>
                 <w:b/>
-                <w:sz w:val="21"/>
+                <w:sz w:val="20"/>
               </w:rPr>
-              <w:t>Co-validación del conocimiento (Lora Sfer, 2014):</w:t>
+              <w:t>Co-validación (Lora Sfer, 2014):</w:t>
             </w:r>
             <w:r>
               <w:rPr>
                 <w:rFonts w:ascii="Arial" w:hAnsi="Arial"/>
-                <w:sz w:val="21"/>
+                <w:sz w:val="20"/>
               </w:rPr>
-              <w:t xml:space="preserve"> Dinámica formativa en la que el saber construido por cada estudiante se somete a revisión, contraste y enriquecimiento progresivo, primero en el grupo pequeño de pares (CIPAS) y después ante el tutor y el grupo general durante la tutoría.</w:t>
+              <w:t xml:space="preserve"> Proceso en el que uno pone a prueba lo que entendió, primero con los compañeros de CIPAS y luego con el tutor, para corregir errores y fijar bien los conceptos.</w:t>
             </w:r>
           </w:p>
           <w:p>
             <w:pPr>
-              <w:spacing w:after="60"/>
-              <w:ind w:left="288"/>
+              <w:spacing w:after="40"/>
+              <w:ind w:left="216"/>
             </w:pPr>
             <w:r>
               <w:rPr>
                 <w:rFonts w:ascii="Arial" w:hAnsi="Arial"/>
                 <w:b/>
-                <w:sz w:val="21"/>
+                <w:sz w:val="20"/>
               </w:rPr>
               <w:t xml:space="preserve">• </w:t>
             </w:r>
@@ -499,28 +426,28 @@
               <w:rPr>
                 <w:rFonts w:ascii="Arial" w:hAnsi="Arial"/>
                 <w:b/>
-                <w:sz w:val="21"/>
+                <w:sz w:val="20"/>
               </w:rPr>
-              <w:t>Carácter dialéctico del aprendizaje:</w:t>
+              <w:t>Carácter dialéctico:</w:t>
             </w:r>
             <w:r>
               <w:rPr>
                 <w:rFonts w:ascii="Arial" w:hAnsi="Arial"/>
-                <w:sz w:val="21"/>
+                <w:sz w:val="20"/>
               </w:rPr>
-              <w:t xml:space="preserve"> Principio que establece que los tres momentos no son compartimentos estancos ni etapas desconectadas; en cada una de ellas están presentes las demás, pues el trabajo individual se realiza en red y el trabajo grupal exige la responsabilidad de cada integrante.</w:t>
+              <w:t xml:space="preserve"> Significa que las tres etapas están amarradas entre sí; el trabajo individual alimenta al CIPAS, y las conclusiones del grupo preparan la tutoría del sábado.</w:t>
             </w:r>
           </w:p>
           <w:p>
             <w:pPr>
-              <w:spacing w:after="60"/>
-              <w:ind w:left="288"/>
+              <w:spacing w:after="40"/>
+              <w:ind w:left="216"/>
             </w:pPr>
             <w:r>
               <w:rPr>
                 <w:rFonts w:ascii="Arial" w:hAnsi="Arial"/>
                 <w:b/>
-                <w:sz w:val="21"/>
+                <w:sz w:val="20"/>
               </w:rPr>
               <w:t xml:space="preserve">• </w:t>
             </w:r>
@@ -528,28 +455,28 @@
               <w:rPr>
                 <w:rFonts w:ascii="Arial" w:hAnsi="Arial"/>
                 <w:b/>
-                <w:sz w:val="21"/>
+                <w:sz w:val="20"/>
               </w:rPr>
               <w:t>Estrategias metacognitivas:</w:t>
             </w:r>
             <w:r>
               <w:rPr>
                 <w:rFonts w:ascii="Arial" w:hAnsi="Arial"/>
-                <w:sz w:val="21"/>
+                <w:sz w:val="20"/>
               </w:rPr>
-              <w:t xml:space="preserve"> Habilidades que permiten al aprendiente monitorear, regular y evaluar su propio proceso de comprensión (saber cómo aprende, identificar vacíos conceptuales y ajustar métodos de estudio).</w:t>
+              <w:t xml:space="preserve"> La capacidad de darse cuenta de cómo aprende uno mismo, identificando qué temas están flojos y ajustando el método antes de la entrega o el examen.</w:t>
             </w:r>
           </w:p>
           <w:p>
             <w:pPr>
-              <w:spacing w:after="60"/>
-              <w:ind w:left="288"/>
+              <w:spacing w:after="40"/>
+              <w:ind w:left="216"/>
             </w:pPr>
             <w:r>
               <w:rPr>
                 <w:rFonts w:ascii="Arial" w:hAnsi="Arial"/>
                 <w:b/>
-                <w:sz w:val="21"/>
+                <w:sz w:val="20"/>
               </w:rPr>
               <w:t xml:space="preserve">• </w:t>
             </w:r>
@@ -557,28 +484,28 @@
               <w:rPr>
                 <w:rFonts w:ascii="Arial" w:hAnsi="Arial"/>
                 <w:b/>
-                <w:sz w:val="21"/>
+                <w:sz w:val="20"/>
               </w:rPr>
-              <w:t>Crédito académico y dedicación temporal:</w:t>
+              <w:t>Crédito académico:</w:t>
             </w:r>
             <w:r>
               <w:rPr>
                 <w:rFonts w:ascii="Arial" w:hAnsi="Arial"/>
-                <w:sz w:val="21"/>
+                <w:sz w:val="20"/>
               </w:rPr>
-              <w:t xml:space="preserve"> Unidad de medida del trabajo del estudiante que equivale formalmente a 48 horas de actividad académica por semestre. En la modalidad a distancia, cada crédito exige articular las horas de tutoría presencial de los sábados con un promedio mínimo de dos a tres horas semanales de estudio independiente no negociables.</w:t>
+              <w:t xml:space="preserve"> Equivale a 48 horas de trabajo del estudiante por semestre. En la modalidad a distancia, cada crédito exige dedicarle entre 2 y 3 horas semanales de estudio por cuenta propia, aparte de las tutorías de los sábados.</w:t>
             </w:r>
           </w:p>
           <w:p>
             <w:pPr>
-              <w:spacing w:after="60"/>
-              <w:ind w:left="288"/>
+              <w:spacing w:after="40"/>
+              <w:ind w:left="216"/>
             </w:pPr>
             <w:r>
               <w:rPr>
                 <w:rFonts w:ascii="Arial" w:hAnsi="Arial"/>
                 <w:b/>
-                <w:sz w:val="21"/>
+                <w:sz w:val="20"/>
               </w:rPr>
               <w:t xml:space="preserve">• </w:t>
             </w:r>
@@ -586,16 +513,16 @@
               <w:rPr>
                 <w:rFonts w:ascii="Arial" w:hAnsi="Arial"/>
                 <w:b/>
-                <w:sz w:val="21"/>
+                <w:sz w:val="20"/>
               </w:rPr>
               <w:t>Autorregulación del tiempo:</w:t>
             </w:r>
             <w:r>
               <w:rPr>
                 <w:rFonts w:ascii="Arial" w:hAnsi="Arial"/>
-                <w:sz w:val="21"/>
+                <w:sz w:val="20"/>
               </w:rPr>
-              <w:t xml:space="preserve"> Capacidad del estudiante para estructurar un cronograma de trabajo estricto y adaptativo basado en los créditos de sus asignaturas, garantizando constancia sin depender de órdenes o supervisión externa.</w:t>
+              <w:t xml:space="preserve"> La disciplina de fijar un horario de estudio semanal y cumplirlo sin necesidad de que nadie esté encima presionando.</w:t>
             </w:r>
           </w:p>
         </w:tc>
@@ -611,7 +538,7 @@
           </w:tcPr>
           <w:p>
             <w:pPr>
-              <w:spacing w:after="80"/>
+              <w:spacing w:after="60"/>
             </w:pPr>
             <w:r/>
             <w:r>
@@ -625,38 +552,38 @@
           </w:p>
           <w:p>
             <w:pPr>
-              <w:spacing w:after="80" w:line="276" w:lineRule="auto"/>
+              <w:spacing w:after="60" w:line="276" w:lineRule="auto"/>
             </w:pPr>
             <w:r>
               <w:rPr>
                 <w:rFonts w:ascii="Arial" w:hAnsi="Arial"/>
-                <w:sz w:val="21"/>
+                <w:sz w:val="20"/>
               </w:rPr>
-              <w:t>El módulo de la Unidad 2 profundiza en el engranaje metodológico que da sentido a la educación a distancia en la Universidad de Cartagena. Aprender en esta modalidad no consiste en sentarse a recibir contenidos de manera pasiva; es un proceso continuo de construcción y validación de conocimientos que se despliega a lo largo de los ciclos tutoriales que transcurren entre un sábado de tutoría y el siguiente.</w:t>
+              <w:t>El módulo de la Unidad 2 explica la lógica con la que funciona la educación a distancia en la Universidad de Cartagena. Estudiar a distancia no es simplemente descargar guías y entregarlas el día del plazo; es un ciclo continuo que se mueve entre tres momentos que dependen directamente uno del otro.</w:t>
             </w:r>
           </w:p>
           <w:p>
             <w:pPr>
-              <w:spacing w:after="80" w:line="276" w:lineRule="auto"/>
+              <w:spacing w:after="60" w:line="276" w:lineRule="auto"/>
             </w:pPr>
             <w:r>
               <w:rPr>
                 <w:rFonts w:ascii="Arial" w:hAnsi="Arial"/>
-                <w:sz w:val="21"/>
+                <w:sz w:val="20"/>
               </w:rPr>
-              <w:t>Como explica el docente e investigador Amaury Lora Sfer (2014), este proceso abarca tres momentos fundamentales que operan como una espiral dialéctica y ascendente. El primer momento corresponde al estudio individual. No se trata de un aislamiento solitario, sino de un trabajo individual en red donde el estudiante lee los módulos, consulta fuentes científicas, toma notas y elabora su protocolo individual. El segundo momento ocurre en los grupos colaborativos (CIPAS), donde contrastamos nuestras ideas, aclaramos dudas con los compañeros y redactamos el protocolo colaborativo. El autor subraya una premisa tajante: el trabajo en equipo fracasa por completo si no está precedido de un estudio individual serio. La colaboración no reemplaza la lectura personal; la complementa.</w:t>
+              <w:t>Amaury Lora Sfer lo deja muy claro: el primer momento es el estudio individual. No se trata de aislarse del mundo, sino de leer el módulo, investigar por cuenta propia, tomar apuntes y armar el protocolo individual. De ahí pasamos al segundo momento, que son los CIPAS. Aquí es donde nos sentamos con el equipo a comparar lo que entendió cada uno, debatir diferencias y redactar el protocolo colaborativo. El autor es tajante en esto: el trabajo en grupo fracasa si los integrantes no leyeron antes por su cuenta. El CIPAS no reemplaza el estudio personal; lo complementa.</w:t>
             </w:r>
           </w:p>
           <w:p>
             <w:pPr>
-              <w:spacing w:after="80" w:line="276" w:lineRule="auto"/>
+              <w:spacing w:after="60" w:line="276" w:lineRule="auto"/>
             </w:pPr>
             <w:r>
               <w:rPr>
                 <w:rFonts w:ascii="Arial" w:hAnsi="Arial"/>
-                <w:sz w:val="21"/>
+                <w:sz w:val="20"/>
               </w:rPr>
-              <w:t>El tercer momento se concreta en la tutoría con el grupo amplio y el profesor. Aquí el tutor mediador no viene a dictar una clase tradicional desde cero, sino a liderar la co-validación de lo trabajado en las etapas previas. A través de sucesivas síntesis y debates, las dudas complejas se resuelven y el saber queda formalmente validado. La lectura concluye con una advertencia lapidaria y realista del autor: la flexibilidad de la educación a distancia es una ventaja para organizar la rutina diaria, pero no hace milagros por sí sola, porque «quien no estudia, no aprende». Sin una planificación rigurosa calculada según los créditos académicos, autodisciplina y competencias lectoescritoras bien desarrolladas, es imposible alcanzar el éxito universitario.</w:t>
+              <w:t>El tercer momento ocurre los sábados en la tutoría con el docente. El profesor no llega a dictar una clase tradicional desde cero, sino a liderar la co-validación. Es el espacio para debatir las dudas complejas que el CIPAS no pudo resolver y consolidar el conocimiento. Al final, el autor lanza una advertencia que me parece la más realista de todo el texto: la flexibilidad de horarios ayuda mucho a coordinar la vida diaria, pero no hace milagros por sí sola, porque «quien no estudia, no aprende». Sin disciplina para dedicarle las horas que exige cada crédito académico y sin una lectura juiciosa, es imposible rendir en la carrera.</w:t>
             </w:r>
           </w:p>
         </w:tc>
@@ -672,7 +599,7 @@
           </w:tcPr>
           <w:p>
             <w:pPr>
-              <w:spacing w:after="80"/>
+              <w:spacing w:after="60"/>
             </w:pPr>
             <w:r/>
             <w:r>
@@ -686,14 +613,14 @@
           </w:p>
           <w:p>
             <w:pPr>
-              <w:spacing w:after="80" w:line="276" w:lineRule="auto"/>
+              <w:spacing w:after="60" w:line="276" w:lineRule="auto"/>
             </w:pPr>
             <w:r>
               <w:rPr>
                 <w:rFonts w:ascii="Arial" w:hAnsi="Arial"/>
-                <w:sz w:val="21"/>
+                <w:sz w:val="20"/>
               </w:rPr>
-              <w:t>Para elaborar este protocolo, comencé descargando el archivo digital del Módulo de la Unidad 2 desde la plataforma SIMA. Realicé una primera lectura exploratoria y luego una lectura crítica detallada, extrayendo las citas de Amaury Lora Sfer y los conceptos nucleares sobre la dinámica tutorial. Registré los puntos clave en mi base de notas en Obsidian, organizando un esquema conceptual sobre la relación entre el trabajo individual, el CIPAS y la tutoría presencial. Además, contrasté estos principios con mi propia rutina semanal en Linux y las herramientas que utilizo para organizar entregas y cronogramas, asegurándome de plasmar reflexiones reales y no respuestas mecánicas.</w:t>
+              <w:t>Descargué el módulo de la Unidad 2 desde la plataforma SIMA y lo leí completo en mi laptop con Linux, resaltando los planteamientos de Amaury Lora Sfer sobre la dinámica de los ciclos tutoriales. Tomé notas en Obsidian para estructurar en limpio la relación entre el trabajo individual, las reuniones de CIPAS y la tutoría presencial. Con base en esos apuntes y revisando mi propio horario de estudio semanal, redacté cada punto de este protocolo con mis propias palabras y reflexiones.</w:t>
             </w:r>
           </w:p>
         </w:tc>
@@ -708,7 +635,7 @@
           </w:tcPr>
           <w:p>
             <w:pPr>
-              <w:spacing w:after="80"/>
+              <w:spacing w:after="60"/>
             </w:pPr>
             <w:r/>
             <w:r>
@@ -722,14 +649,14 @@
           </w:p>
           <w:p>
             <w:pPr>
-              <w:spacing w:after="80" w:line="276" w:lineRule="auto"/>
+              <w:spacing w:after="60" w:line="276" w:lineRule="auto"/>
             </w:pPr>
             <w:r>
               <w:rPr>
                 <w:rFonts w:ascii="Arial" w:hAnsi="Arial"/>
-                <w:sz w:val="21"/>
+                <w:sz w:val="20"/>
               </w:rPr>
-              <w:t>Esta lectura me dejó una certeza muy clara: la metodología de los tres momentos es la columna vertebral de nuestra carrera. Si uno descuida el primer momento (el estudio autónomo semanal), llega desarmado a la reunión del CIPAS y termina convirtiendo el trabajo colaborativo en una carga para los demás o en un simple reparto de partes sin sentido. La verdadera ganancia del modelo a distancia está en la co-validación: contrastar lo que entendí por mi cuenta frente al criterio de mis compañeros de equipo y la experiencia del tutor. Entendí además que la flexibilidad de horarios no es sinónimo de tiempo libre desordenado; requiere fijar bloques inamovibles de estudio en la agenda diaria para cumplir con las exigencias de cada crédito académico.</w:t>
+              <w:t>Esta lectura me confirmó que los tres momentos son la base para no perderse en la carrera. Si uno no se toma en serio el estudio individual durante la semana, llega al CIPAS sin nada que aportar y el trabajo en equipo se vuelve una molestia. La verdadera ventaja de esta modalidad está en la co-validación: poder confrontar mis apuntes con el criterio del grupo y del tutor para saber si realmente estoy entendiendo. Además, me quedó claro que tener flexibilidad de horario no es tener tiempo libre para procrastinar, sino la responsabilidad de apartar bloques fijos en la semana para cumplir con las horas que exige cada crédito.</w:t>
             </w:r>
           </w:p>
         </w:tc>
@@ -744,7 +671,7 @@
           </w:tcPr>
           <w:p>
             <w:pPr>
-              <w:spacing w:after="80"/>
+              <w:spacing w:after="60"/>
             </w:pPr>
             <w:r/>
             <w:r>
@@ -758,26 +685,26 @@
           </w:p>
           <w:p>
             <w:pPr>
-              <w:spacing w:after="80" w:line="276" w:lineRule="auto"/>
+              <w:spacing w:after="60" w:line="276" w:lineRule="auto"/>
             </w:pPr>
             <w:r>
               <w:rPr>
                 <w:rFonts w:ascii="Arial" w:hAnsi="Arial"/>
-                <w:sz w:val="21"/>
+                <w:sz w:val="20"/>
               </w:rPr>
-              <w:t>En la práctica cotidiana de los grupos CIPAS, el vicio más común y destructivo es caer en el «reparto de pedazos»: asignarle una pregunta o una sección a cada integrante y pegar todo al final como una colcha de retazos, sin que nadie lea ni debata lo que escribió el otro. Esta mala práctica destruye por completo el segundo momento del aprendizaje y anula la co-validación de la que habla el profesor Lora Sfer, ya que no hay debate real ni enriquecimiento mutuo.</w:t>
+              <w:t>En el día a día de los CIPAS, el error más repetido es el «reparto de pedazos»: asignarle un punto a cada quien y luego pegar todo al final como una colcha de retazos, sin que nadie revise lo que hizo el compañero. Esa costumbre rompe por completo el segundo momento del aprendizaje porque elimina el debate y la co-validación que plantea el módulo.</w:t>
             </w:r>
           </w:p>
           <w:p>
             <w:pPr>
-              <w:spacing w:after="80" w:line="276" w:lineRule="auto"/>
+              <w:spacing w:after="60" w:line="276" w:lineRule="auto"/>
             </w:pPr>
             <w:r>
               <w:rPr>
                 <w:rFonts w:ascii="Arial" w:hAnsi="Arial"/>
-                <w:sz w:val="21"/>
+                <w:sz w:val="20"/>
               </w:rPr>
-              <w:t>Como recomendación concreta, propongo que dentro de los equipos de trabajo se establezca como regla innegociable que ningún integrante pueda participar en la redacción del protocolo colaborativo si antes no ha presentado su protocolo individual ya terminado. Asimismo, sugiero que los debates se realicen sobre un documento compartido en Google Docs con control de cambios, revisando párrafo por párrafo hasta llegar a un verdadero consenso grupal antes de asistir a la tutoría presencial del sábado.</w:t>
+              <w:t>Mi recomendación para evitar esto es fijar una regla clara en el equipo: nadie entra a armar el protocolo colaborativo si no tiene listo y compartido su protocolo individual. También sugiero que los acuerdos se hagan trabajando sobre un documento compartido en Google Docs o repositorio, revisando punto por punto para que el sábado lleguemos a la tutoría con dudas reales de fondo y no con un texto pegado a las carreras.</w:t>
             </w:r>
           </w:p>
         </w:tc>
@@ -792,7 +719,7 @@
           </w:tcPr>
           <w:p>
             <w:pPr>
-              <w:spacing w:after="80"/>
+              <w:spacing w:after="60"/>
             </w:pPr>
             <w:r/>
             <w:r>
@@ -806,77 +733,77 @@
           </w:p>
           <w:p>
             <w:pPr>
-              <w:spacing w:after="60"/>
-              <w:ind w:left="288"/>
+              <w:spacing w:after="40"/>
+              <w:ind w:left="216"/>
             </w:pPr>
             <w:r>
               <w:rPr>
                 <w:rFonts w:ascii="Arial" w:hAnsi="Arial"/>
                 <w:b/>
-                <w:sz w:val="21"/>
+                <w:sz w:val="20"/>
               </w:rPr>
               <w:t xml:space="preserve">• </w:t>
             </w:r>
             <w:r>
               <w:rPr>
                 <w:rFonts w:ascii="Arial" w:hAnsi="Arial"/>
-                <w:sz w:val="21"/>
+                <w:sz w:val="20"/>
               </w:rPr>
               <w:t>Lora Sfer, A. (2014). Los tres momentos del aprendizaje en la educación a distancia. Universidad de Cartagena.</w:t>
             </w:r>
           </w:p>
           <w:p>
             <w:pPr>
-              <w:spacing w:after="60"/>
-              <w:ind w:left="288"/>
+              <w:spacing w:after="40"/>
+              <w:ind w:left="216"/>
             </w:pPr>
             <w:r>
               <w:rPr>
                 <w:rFonts w:ascii="Arial" w:hAnsi="Arial"/>
                 <w:b/>
-                <w:sz w:val="21"/>
+                <w:sz w:val="20"/>
               </w:rPr>
               <w:t xml:space="preserve">• </w:t>
             </w:r>
             <w:r>
               <w:rPr>
                 <w:rFonts w:ascii="Arial" w:hAnsi="Arial"/>
-                <w:sz w:val="21"/>
+                <w:sz w:val="20"/>
               </w:rPr>
               <w:t>Bermúdez Mendieta, J. (2021). El aprendizaje basado en problemas para mejorar el pensamiento crítico. INNOVA Research Journal.</w:t>
             </w:r>
           </w:p>
           <w:p>
             <w:pPr>
-              <w:spacing w:after="60"/>
-              <w:ind w:left="288"/>
+              <w:spacing w:after="40"/>
+              <w:ind w:left="216"/>
             </w:pPr>
             <w:r>
               <w:rPr>
                 <w:rFonts w:ascii="Arial" w:hAnsi="Arial"/>
                 <w:b/>
-                <w:sz w:val="21"/>
+                <w:sz w:val="20"/>
               </w:rPr>
               <w:t xml:space="preserve">• </w:t>
             </w:r>
             <w:r>
               <w:rPr>
                 <w:rFonts w:ascii="Arial" w:hAnsi="Arial"/>
-                <w:sz w:val="21"/>
+                <w:sz w:val="20"/>
               </w:rPr>
               <w:t>Costa Román, Ó., &amp; García Gaitero, O. (2017). El aprendizaje autorregulado y las estrategias de aprendizaje. Tendencias Pedagógicas.</w:t>
             </w:r>
           </w:p>
           <w:p>
             <w:pPr>
-              <w:spacing w:after="60"/>
-              <w:ind w:left="288"/>
+              <w:spacing w:after="40"/>
+              <w:ind w:left="216"/>
             </w:pPr>
             <w:r>
               <w:rPr>
                 <w:rFonts w:ascii="Arial" w:hAnsi="Arial"/>
                 <w:b/>
-                <w:sz w:val="21"/>
+                <w:sz w:val="20"/>
               </w:rPr>
               <w:t xml:space="preserve">• </w:t>
             </w:r>
@@ -884,14 +811,14 @@
               <w:rPr>
                 <w:rFonts w:ascii="Arial" w:hAnsi="Arial"/>
                 <w:b/>
-                <w:sz w:val="21"/>
+                <w:sz w:val="20"/>
               </w:rPr>
               <w:t>Universidad de Cartagena - CTEV. (2026). Módulo Unidad 2:</w:t>
             </w:r>
             <w:r>
               <w:rPr>
                 <w:rFonts w:ascii="Arial" w:hAnsi="Arial"/>
-                <w:sz w:val="21"/>
+                <w:sz w:val="20"/>
               </w:rPr>
               <w:t xml:space="preserve"> Momentos de Aprendizaje Metodología a Distancia. Centro de Tecnologías para la Educación Virtual. Cartagena, Colombia.</w:t>
             </w:r>
@@ -899,79 +826,6 @@
         </w:tc>
       </w:tr>
     </w:tbl>
-    <w:p>
-      <w:pPr>
-        <w:pBdr/>
-        <w:spacing/>
-        <w:ind/>
-        <w:jc w:val="left"/>
-        <w:rPr>
-          <w:rFonts w:ascii="Arial" w:hAnsi="Arial" w:eastAsia="Arial" w:cs="Arial"/>
-          <w:b/>
-          <w:bCs/>
-          <w:color w:val="1f3864"/>
-        </w:rPr>
-      </w:pPr>
-      <w:r>
-        <w:rPr>
-          <w:rFonts w:ascii="Arial" w:hAnsi="Arial" w:eastAsia="Arial" w:cs="Arial"/>
-          <w:b/>
-          <w:bCs/>
-          <w:color w:val="1f3864"/>
-        </w:rPr>
-      </w:r>
-      <w:r>
-        <w:rPr>
-          <w:rFonts w:ascii="Arial" w:hAnsi="Arial" w:eastAsia="Arial" w:cs="Arial"/>
-          <w:b/>
-          <w:bCs/>
-          <w:color w:val="1f3864"/>
-        </w:rPr>
-      </w:r>
-      <w:r>
-        <w:rPr>
-          <w:rFonts w:ascii="Arial" w:hAnsi="Arial" w:eastAsia="Arial" w:cs="Arial"/>
-          <w:b/>
-          <w:bCs/>
-          <w:color w:val="1f3864"/>
-        </w:rPr>
-      </w:r>
-    </w:p>
-    <w:p>
-      <w:pPr>
-        <w:pBdr/>
-        <w:spacing/>
-        <w:ind/>
-        <w:jc w:val="center"/>
-        <w:rPr>
-          <w:rFonts w:ascii="Arial" w:hAnsi="Arial" w:eastAsia="Arial" w:cs="Arial"/>
-          <w:b/>
-          <w:bCs/>
-          <w:color w:val="1f3864"/>
-        </w:rPr>
-      </w:pPr>
-      <w:r>
-        <w:rPr>
-          <w:rtl w:val="0"/>
-        </w:rPr>
-      </w:r>
-      <w:r>
-        <w:rPr>
-          <w:rFonts w:ascii="Arial" w:hAnsi="Arial" w:eastAsia="Arial" w:cs="Arial"/>
-          <w:b/>
-          <w:bCs/>
-          <w:color w:val="1f3864"/>
-        </w:rPr>
-      </w:r>
-      <w:r>
-        <w:rPr>
-          <w:rFonts w:ascii="Arial" w:hAnsi="Arial" w:eastAsia="Arial" w:cs="Arial"/>
-          <w:b/>
-          <w:bCs/>
-          <w:color w:val="1f3864"/>
-        </w:rPr>
-      </w:r>
-    </w:p>
     <w:sectPr>
       <w:headerReference w:type="default" r:id="rId8"/>
       <w:footerReference w:type="default" r:id="rId9"/>

</xml_diff>

<commit_message>
docs: sync deliverables, collaborate protocols U2, and update semester roadmap
</commit_message>
<xml_diff>
--- a/Metodología de la Educación a Distancia/Entregables/Protocolo Individual 2 - Metodologia.docx
+++ b/Metodología de la Educación a Distancia/Entregables/Protocolo Individual 2 - Metodologia.docx
@@ -35,108 +35,249 @@
           </w:tcPr>
           <w:p>
             <w:pPr>
+              <w:pBdr/>
               <w:spacing w:after="60"/>
+              <w:ind/>
+              <w:jc w:val="center"/>
+              <w:rPr>
+                <w:rFonts w:ascii="Times New Roman" w:hAnsi="Times New Roman" w:eastAsia="Times New Roman" w:cs="Times New Roman"/>
+                <w:b/>
+                <w:bCs/>
+                <w:sz w:val="24"/>
+                <w:szCs w:val="24"/>
+              </w:rPr>
             </w:pPr>
-            <w:r/>
             <w:r>
               <w:rPr>
-                <w:rFonts w:ascii="Arial" w:hAnsi="Arial"/>
+                <w:rFonts w:ascii="Times New Roman" w:hAnsi="Times New Roman" w:eastAsia="Times New Roman" w:cs="Times New Roman"/>
                 <w:b/>
                 <w:sz w:val="24"/>
+                <w:szCs w:val="24"/>
               </w:rPr>
-              <w:t>Protocolo individual — Unidad 2: Momentos de Aprendizaje Metodología a Distancia</w:t>
+              <w:t xml:space="preserve">Protocolo individual  Unidad 2</w:t>
+            </w:r>
+            <w:r>
+              <w:rPr>
+                <w:rFonts w:ascii="Times New Roman" w:hAnsi="Times New Roman" w:cs="Times New Roman"/>
+                <w:sz w:val="24"/>
+                <w:szCs w:val="24"/>
+              </w:rPr>
             </w:r>
           </w:p>
           <w:p>
             <w:pPr>
-              <w:spacing w:after="40"/>
+              <w:pBdr/>
+              <w:spacing w:after="60"/>
+              <w:ind/>
+              <w:jc w:val="center"/>
+              <w:rPr>
+                <w:rFonts w:ascii="Times New Roman" w:hAnsi="Times New Roman" w:eastAsia="Times New Roman" w:cs="Times New Roman"/>
+                <w:b/>
+                <w:bCs/>
+                <w:sz w:val="24"/>
+                <w:szCs w:val="24"/>
+                <w:highlight w:val="none"/>
+              </w:rPr>
             </w:pPr>
             <w:r>
               <w:rPr>
-                <w:rFonts w:ascii="Arial" w:hAnsi="Arial"/>
+                <w:rFonts w:ascii="Times New Roman" w:hAnsi="Times New Roman" w:eastAsia="Times New Roman" w:cs="Times New Roman"/>
                 <w:b/>
-                <w:sz w:val="21"/>
+                <w:sz w:val="24"/>
+                <w:szCs w:val="24"/>
+              </w:rPr>
+              <w:t xml:space="preserve">Momentos de Aprendizaje Metodología a Distancia</w:t>
+            </w:r>
+            <w:r>
+              <w:rPr>
+                <w:rFonts w:ascii="Times New Roman" w:hAnsi="Times New Roman" w:cs="Times New Roman"/>
+                <w:sz w:val="24"/>
+                <w:szCs w:val="24"/>
+              </w:rPr>
+            </w:r>
+          </w:p>
+          <w:p>
+            <w:pPr>
+              <w:pBdr/>
+              <w:spacing w:after="60"/>
+              <w:ind/>
+              <w:jc w:val="center"/>
+              <w:rPr>
+                <w:rFonts w:ascii="Times New Roman" w:hAnsi="Times New Roman" w:cs="Times New Roman"/>
+                <w:sz w:val="24"/>
+                <w:szCs w:val="24"/>
+              </w:rPr>
+            </w:pPr>
+            <w:r>
+              <w:rPr>
+                <w:rFonts w:ascii="Times New Roman" w:hAnsi="Times New Roman" w:eastAsia="Times New Roman" w:cs="Times New Roman"/>
+                <w:b/>
+                <w:sz w:val="24"/>
+                <w:szCs w:val="24"/>
+                <w:highlight w:val="none"/>
+              </w:rPr>
+            </w:r>
+            <w:r>
+              <w:rPr>
+                <w:rFonts w:ascii="Times New Roman" w:hAnsi="Times New Roman" w:eastAsia="Times New Roman" w:cs="Times New Roman"/>
+                <w:b/>
+                <w:sz w:val="24"/>
+                <w:szCs w:val="24"/>
+                <w:highlight w:val="none"/>
+              </w:rPr>
+            </w:r>
+            <w:r>
+              <w:rPr>
+                <w:rFonts w:ascii="Times New Roman" w:hAnsi="Times New Roman" w:eastAsia="Times New Roman" w:cs="Times New Roman"/>
+                <w:b/>
+                <w:sz w:val="24"/>
+                <w:szCs w:val="24"/>
+                <w:highlight w:val="none"/>
+              </w:rPr>
+            </w:r>
+          </w:p>
+          <w:p>
+            <w:pPr>
+              <w:pBdr/>
+              <w:spacing w:after="40"/>
+              <w:ind/>
+              <w:rPr>
+                <w:rFonts w:ascii="Times New Roman" w:hAnsi="Times New Roman" w:cs="Times New Roman"/>
+                <w:sz w:val="24"/>
+                <w:szCs w:val="24"/>
+              </w:rPr>
+            </w:pPr>
+            <w:r>
+              <w:rPr>
+                <w:rFonts w:ascii="Times New Roman" w:hAnsi="Times New Roman" w:eastAsia="Times New Roman" w:cs="Times New Roman"/>
+                <w:b/>
+                <w:sz w:val="24"/>
+                <w:szCs w:val="24"/>
               </w:rPr>
               <w:t xml:space="preserve">Asignatura: </w:t>
             </w:r>
             <w:r>
               <w:rPr>
-                <w:rFonts w:ascii="Arial" w:hAnsi="Arial"/>
-                <w:sz w:val="21"/>
+                <w:rFonts w:ascii="Times New Roman" w:hAnsi="Times New Roman" w:eastAsia="Times New Roman" w:cs="Times New Roman"/>
+                <w:sz w:val="24"/>
+                <w:szCs w:val="24"/>
               </w:rPr>
-              <w:t>Metodologías y Estrategias de la Educación a Distancia (MEAD)</w:t>
+              <w:t xml:space="preserve">Metodologías y Estrategias de la Educación a Distancia</w:t>
+            </w:r>
+            <w:r>
+              <w:rPr>
+                <w:rFonts w:ascii="Times New Roman" w:hAnsi="Times New Roman" w:eastAsia="Times New Roman" w:cs="Times New Roman"/>
+                <w:sz w:val="24"/>
+                <w:szCs w:val="24"/>
+              </w:rPr>
             </w:r>
           </w:p>
           <w:p>
             <w:pPr>
+              <w:pBdr/>
               <w:spacing w:after="40"/>
+              <w:ind/>
+              <w:rPr>
+                <w:rFonts w:ascii="Times New Roman" w:hAnsi="Times New Roman" w:cs="Times New Roman"/>
+                <w:sz w:val="24"/>
+                <w:szCs w:val="24"/>
+              </w:rPr>
             </w:pPr>
             <w:r>
               <w:rPr>
-                <w:rFonts w:ascii="Arial" w:hAnsi="Arial"/>
+                <w:rFonts w:ascii="Times New Roman" w:hAnsi="Times New Roman" w:eastAsia="Times New Roman" w:cs="Times New Roman"/>
                 <w:b/>
-                <w:sz w:val="21"/>
+                <w:sz w:val="24"/>
+                <w:szCs w:val="24"/>
               </w:rPr>
               <w:t xml:space="preserve">Nombre: </w:t>
             </w:r>
             <w:r>
               <w:rPr>
-                <w:rFonts w:ascii="Arial" w:hAnsi="Arial"/>
-                <w:sz w:val="21"/>
+                <w:rFonts w:ascii="Times New Roman" w:hAnsi="Times New Roman" w:eastAsia="Times New Roman" w:cs="Times New Roman"/>
+                <w:sz w:val="24"/>
+                <w:szCs w:val="24"/>
               </w:rPr>
-              <w:t>Esteban David Marrugo Jassir</w:t>
+              <w:t xml:space="preserve">Esteban David Marrugo Jassir</w:t>
+            </w:r>
+            <w:r>
+              <w:rPr>
+                <w:rFonts w:ascii="Times New Roman" w:hAnsi="Times New Roman" w:eastAsia="Times New Roman" w:cs="Times New Roman"/>
+                <w:sz w:val="24"/>
+                <w:szCs w:val="24"/>
+              </w:rPr>
             </w:r>
           </w:p>
           <w:p>
             <w:pPr>
+              <w:pBdr/>
               <w:spacing w:after="60"/>
+              <w:ind/>
+              <w:rPr>
+                <w:rFonts w:ascii="Times New Roman" w:hAnsi="Times New Roman" w:cs="Times New Roman"/>
+                <w:sz w:val="24"/>
+                <w:szCs w:val="24"/>
+              </w:rPr>
             </w:pPr>
             <w:r>
               <w:rPr>
-                <w:rFonts w:ascii="Arial" w:hAnsi="Arial"/>
+                <w:rFonts w:ascii="Times New Roman" w:hAnsi="Times New Roman" w:eastAsia="Times New Roman" w:cs="Times New Roman"/>
                 <w:b/>
-                <w:sz w:val="21"/>
+                <w:sz w:val="24"/>
+                <w:szCs w:val="24"/>
               </w:rPr>
               <w:t xml:space="preserve">Programa: </w:t>
             </w:r>
             <w:r>
               <w:rPr>
-                <w:rFonts w:ascii="Arial" w:hAnsi="Arial"/>
-                <w:sz w:val="21"/>
+                <w:rFonts w:ascii="Times New Roman" w:hAnsi="Times New Roman" w:eastAsia="Times New Roman" w:cs="Times New Roman"/>
+                <w:sz w:val="24"/>
+                <w:szCs w:val="24"/>
               </w:rPr>
-              <w:t>Ingeniería de Software</w:t>
+              <w:t xml:space="preserve">Ingeniería de Software</w:t>
               <w:br/>
             </w:r>
             <w:r>
               <w:rPr>
-                <w:rFonts w:ascii="Arial" w:hAnsi="Arial"/>
+                <w:rFonts w:ascii="Times New Roman" w:hAnsi="Times New Roman" w:eastAsia="Times New Roman" w:cs="Times New Roman"/>
                 <w:b/>
-                <w:sz w:val="21"/>
+                <w:sz w:val="24"/>
+                <w:szCs w:val="24"/>
               </w:rPr>
               <w:t xml:space="preserve">Código: </w:t>
             </w:r>
             <w:r>
               <w:rPr>
-                <w:rFonts w:ascii="Arial" w:hAnsi="Arial"/>
-                <w:sz w:val="21"/>
+                <w:rFonts w:ascii="Times New Roman" w:hAnsi="Times New Roman" w:eastAsia="Times New Roman" w:cs="Times New Roman"/>
+                <w:sz w:val="24"/>
+                <w:szCs w:val="24"/>
               </w:rPr>
-              <w:t>7502620036</w:t>
+              <w:t xml:space="preserve">7502620036</w:t>
               <w:br/>
             </w:r>
             <w:r>
               <w:rPr>
-                <w:rFonts w:ascii="Arial" w:hAnsi="Arial"/>
+                <w:rFonts w:ascii="Times New Roman" w:hAnsi="Times New Roman" w:eastAsia="Times New Roman" w:cs="Times New Roman"/>
                 <w:b/>
-                <w:sz w:val="21"/>
+                <w:sz w:val="24"/>
+                <w:szCs w:val="24"/>
               </w:rPr>
               <w:t xml:space="preserve">Semestre: </w:t>
             </w:r>
             <w:r>
               <w:rPr>
-                <w:rFonts w:ascii="Arial" w:hAnsi="Arial"/>
-                <w:sz w:val="21"/>
+                <w:rFonts w:ascii="Times New Roman" w:hAnsi="Times New Roman" w:eastAsia="Times New Roman" w:cs="Times New Roman"/>
+                <w:sz w:val="24"/>
+                <w:szCs w:val="24"/>
               </w:rPr>
-              <w:t>1</w:t>
+              <w:t xml:space="preserve">1</w:t>
+            </w:r>
+            <w:r>
+              <w:rPr>
+                <w:rFonts w:ascii="Times New Roman" w:hAnsi="Times New Roman" w:eastAsia="Times New Roman" w:cs="Times New Roman"/>
+                <w:sz w:val="24"/>
+                <w:szCs w:val="24"/>
+              </w:rPr>
             </w:r>
           </w:p>
         </w:tc>
@@ -151,28 +292,65 @@
           </w:tcPr>
           <w:p>
             <w:pPr>
+              <w:pBdr/>
               <w:spacing w:after="60"/>
+              <w:ind/>
+              <w:rPr>
+                <w:rFonts w:ascii="Times New Roman" w:hAnsi="Times New Roman" w:cs="Times New Roman"/>
+                <w:sz w:val="24"/>
+                <w:szCs w:val="24"/>
+              </w:rPr>
             </w:pPr>
-            <w:r/>
             <w:r>
               <w:rPr>
-                <w:rFonts w:ascii="Arial" w:hAnsi="Arial"/>
+                <w:rFonts w:ascii="Times New Roman" w:hAnsi="Times New Roman" w:eastAsia="Times New Roman" w:cs="Times New Roman"/>
                 <w:b/>
-                <w:sz w:val="22"/>
+                <w:sz w:val="24"/>
+                <w:szCs w:val="24"/>
               </w:rPr>
-              <w:t>Descripción del texto o actividad a realizar:</w:t>
+              <w:t xml:space="preserve">Descripción del texto o actividad a realizar:</w:t>
+            </w:r>
+            <w:r>
+              <w:rPr>
+                <w:rFonts w:ascii="Times New Roman" w:hAnsi="Times New Roman" w:eastAsia="Times New Roman" w:cs="Times New Roman"/>
+                <w:sz w:val="24"/>
+                <w:szCs w:val="24"/>
+              </w:rPr>
             </w:r>
           </w:p>
           <w:p>
             <w:pPr>
+              <w:pBdr/>
               <w:spacing w:after="60" w:line="276" w:lineRule="auto"/>
+              <w:ind/>
+              <w:rPr>
+                <w:rFonts w:ascii="Times New Roman" w:hAnsi="Times New Roman" w:cs="Times New Roman"/>
+                <w:sz w:val="24"/>
+                <w:szCs w:val="24"/>
+              </w:rPr>
             </w:pPr>
             <w:r>
               <w:rPr>
-                <w:rFonts w:ascii="Arial" w:hAnsi="Arial"/>
-                <w:sz w:val="20"/>
+                <w:rFonts w:ascii="Times New Roman" w:hAnsi="Times New Roman" w:eastAsia="Times New Roman" w:cs="Times New Roman"/>
+                <w:sz w:val="24"/>
+                <w:szCs w:val="24"/>
               </w:rPr>
-              <w:t>Revisión y análisis del módulo de la Unidad 2 sobre los tres momentos del aprendizaje a distancia (estudio individual, trabajo en CIPAS y tutoría presencial), evaluando cómo se organiza el tiempo de estudio y cómo se valida el conocimiento a lo largo del semestre.</w:t>
+              <w:t xml:space="preserve">Revisión</w:t>
+            </w:r>
+            <w:r>
+              <w:rPr>
+                <w:rFonts w:ascii="Times New Roman" w:hAnsi="Times New Roman" w:eastAsia="Times New Roman" w:cs="Times New Roman"/>
+                <w:sz w:val="24"/>
+                <w:szCs w:val="24"/>
+              </w:rPr>
+              <w:t xml:space="preserve"> y análisis del módulo de la Unidad 2 sobre los tres momentos del aprendizaje a distancia (estudio individual, trabajo en CIPAS y tutoría presencial), evaluando cómo se organiza el tiempo de estudio y cómo se valida el conocimiento a lo largo del semestre.</w:t>
+            </w:r>
+            <w:r>
+              <w:rPr>
+                <w:rFonts w:ascii="Times New Roman" w:hAnsi="Times New Roman" w:eastAsia="Times New Roman" w:cs="Times New Roman"/>
+                <w:sz w:val="24"/>
+                <w:szCs w:val="24"/>
+              </w:rPr>
             </w:r>
           </w:p>
         </w:tc>
@@ -187,28 +365,57 @@
           </w:tcPr>
           <w:p>
             <w:pPr>
+              <w:pBdr/>
               <w:spacing w:after="60"/>
+              <w:ind/>
+              <w:rPr>
+                <w:rFonts w:ascii="Times New Roman" w:hAnsi="Times New Roman" w:cs="Times New Roman"/>
+                <w:sz w:val="24"/>
+                <w:szCs w:val="24"/>
+              </w:rPr>
             </w:pPr>
-            <w:r/>
             <w:r>
               <w:rPr>
-                <w:rFonts w:ascii="Arial" w:hAnsi="Arial"/>
+                <w:rFonts w:ascii="Times New Roman" w:hAnsi="Times New Roman" w:eastAsia="Times New Roman" w:cs="Times New Roman"/>
                 <w:b/>
-                <w:sz w:val="22"/>
+                <w:sz w:val="24"/>
+                <w:szCs w:val="24"/>
               </w:rPr>
-              <w:t>Palabras claves:</w:t>
+              <w:t xml:space="preserve">Palabras claves:</w:t>
+            </w:r>
+            <w:r>
+              <w:rPr>
+                <w:rFonts w:ascii="Times New Roman" w:hAnsi="Times New Roman" w:eastAsia="Times New Roman" w:cs="Times New Roman"/>
+                <w:sz w:val="24"/>
+                <w:szCs w:val="24"/>
+              </w:rPr>
             </w:r>
           </w:p>
           <w:p>
             <w:pPr>
+              <w:pBdr/>
               <w:spacing w:after="60" w:line="276" w:lineRule="auto"/>
+              <w:ind/>
+              <w:rPr>
+                <w:rFonts w:ascii="Times New Roman" w:hAnsi="Times New Roman" w:cs="Times New Roman"/>
+                <w:sz w:val="24"/>
+                <w:szCs w:val="24"/>
+              </w:rPr>
             </w:pPr>
             <w:r>
               <w:rPr>
-                <w:rFonts w:ascii="Arial" w:hAnsi="Arial"/>
-                <w:sz w:val="20"/>
+                <w:rFonts w:ascii="Times New Roman" w:hAnsi="Times New Roman" w:eastAsia="Times New Roman" w:cs="Times New Roman"/>
+                <w:sz w:val="24"/>
+                <w:szCs w:val="24"/>
               </w:rPr>
-              <w:t>Momentos del aprendizaje, Amaury Lora Sfer, Trabajo en red, CIPAS, Tutoría de co-validación, Aprendizaje autónomo, Crédito académico, Gestión del tiempo, Metacognición, Síntesis tutorial.</w:t>
+              <w:t xml:space="preserve">Momentos del aprendizaje, Amaury Lora Sfer, Trabajo en red, CIPAS, Tutoría de co-validación, Aprendizaje autónomo, Crédito académico, Gestión del tiempo, Metacognición, Síntesis tutorial.</w:t>
+            </w:r>
+            <w:r>
+              <w:rPr>
+                <w:rFonts w:ascii="Times New Roman" w:hAnsi="Times New Roman" w:eastAsia="Times New Roman" w:cs="Times New Roman"/>
+                <w:sz w:val="24"/>
+                <w:szCs w:val="24"/>
+              </w:rPr>
             </w:r>
           </w:p>
         </w:tc>
@@ -223,108 +430,183 @@
           </w:tcPr>
           <w:p>
             <w:pPr>
+              <w:pBdr/>
               <w:spacing w:after="60"/>
+              <w:ind/>
+              <w:rPr>
+                <w:rFonts w:ascii="Times New Roman" w:hAnsi="Times New Roman" w:cs="Times New Roman"/>
+                <w:sz w:val="24"/>
+                <w:szCs w:val="24"/>
+              </w:rPr>
             </w:pPr>
-            <w:r/>
             <w:r>
               <w:rPr>
-                <w:rFonts w:ascii="Arial" w:hAnsi="Arial"/>
+                <w:rFonts w:ascii="Times New Roman" w:hAnsi="Times New Roman" w:eastAsia="Times New Roman" w:cs="Times New Roman"/>
                 <w:b/>
-                <w:sz w:val="22"/>
+                <w:sz w:val="24"/>
+                <w:szCs w:val="24"/>
               </w:rPr>
-              <w:t>Objetivos de las lecturas o actividad a realizar:</w:t>
+              <w:t xml:space="preserve">Objetivos de las lecturas o actividad a realizar:</w:t>
+            </w:r>
+            <w:r>
+              <w:rPr>
+                <w:rFonts w:ascii="Times New Roman" w:hAnsi="Times New Roman" w:eastAsia="Times New Roman" w:cs="Times New Roman"/>
+                <w:sz w:val="24"/>
+                <w:szCs w:val="24"/>
+              </w:rPr>
             </w:r>
           </w:p>
           <w:p>
             <w:pPr>
+              <w:pBdr/>
               <w:spacing w:after="40"/>
               <w:ind w:left="216"/>
+              <w:rPr>
+                <w:rFonts w:ascii="Times New Roman" w:hAnsi="Times New Roman" w:cs="Times New Roman"/>
+                <w:sz w:val="24"/>
+                <w:szCs w:val="24"/>
+              </w:rPr>
             </w:pPr>
             <w:r>
               <w:rPr>
-                <w:rFonts w:ascii="Arial" w:hAnsi="Arial"/>
+                <w:rFonts w:ascii="Times New Roman" w:hAnsi="Times New Roman" w:eastAsia="Times New Roman" w:cs="Times New Roman"/>
                 <w:b/>
-                <w:sz w:val="20"/>
+                <w:sz w:val="24"/>
+                <w:szCs w:val="24"/>
               </w:rPr>
               <w:t xml:space="preserve">• </w:t>
             </w:r>
             <w:r>
               <w:rPr>
-                <w:rFonts w:ascii="Arial" w:hAnsi="Arial"/>
-                <w:sz w:val="20"/>
+                <w:rFonts w:ascii="Times New Roman" w:hAnsi="Times New Roman" w:eastAsia="Times New Roman" w:cs="Times New Roman"/>
+                <w:sz w:val="24"/>
+                <w:szCs w:val="24"/>
               </w:rPr>
-              <w:t>Entender cómo se conectan los tres momentos del aprendizaje y por qué ninguno funciona si se salta el anterior.</w:t>
+              <w:t xml:space="preserve">Entender cómo se conectan los tres momentos del aprendizaje y por qué ninguno funciona si se salta el anterior.</w:t>
+            </w:r>
+            <w:r>
+              <w:rPr>
+                <w:rFonts w:ascii="Times New Roman" w:hAnsi="Times New Roman" w:eastAsia="Times New Roman" w:cs="Times New Roman"/>
+                <w:sz w:val="24"/>
+                <w:szCs w:val="24"/>
+              </w:rPr>
             </w:r>
           </w:p>
           <w:p>
             <w:pPr>
+              <w:pBdr/>
               <w:spacing w:after="40"/>
               <w:ind w:left="216"/>
+              <w:rPr>
+                <w:rFonts w:ascii="Times New Roman" w:hAnsi="Times New Roman" w:cs="Times New Roman"/>
+                <w:sz w:val="24"/>
+                <w:szCs w:val="24"/>
+              </w:rPr>
             </w:pPr>
             <w:r>
               <w:rPr>
-                <w:rFonts w:ascii="Arial" w:hAnsi="Arial"/>
+                <w:rFonts w:ascii="Times New Roman" w:hAnsi="Times New Roman" w:eastAsia="Times New Roman" w:cs="Times New Roman"/>
                 <w:b/>
-                <w:sz w:val="20"/>
+                <w:sz w:val="24"/>
+                <w:szCs w:val="24"/>
               </w:rPr>
               <w:t xml:space="preserve">• </w:t>
             </w:r>
             <w:r>
               <w:rPr>
-                <w:rFonts w:ascii="Arial" w:hAnsi="Arial"/>
-                <w:sz w:val="20"/>
+                <w:rFonts w:ascii="Times New Roman" w:hAnsi="Times New Roman" w:eastAsia="Times New Roman" w:cs="Times New Roman"/>
+                <w:sz w:val="24"/>
+                <w:szCs w:val="24"/>
               </w:rPr>
-              <w:t>Reconocer que el CIPAS no es para dividirse tareas, sino para discutir lo que cada uno ya estudió por su cuenta.</w:t>
+              <w:t xml:space="preserve">Reconocer que el CIPAS no es para dividirse tareas, sino para discutir lo que cada uno ya estudió por su cuenta.</w:t>
+            </w:r>
+            <w:r>
+              <w:rPr>
+                <w:rFonts w:ascii="Times New Roman" w:hAnsi="Times New Roman" w:eastAsia="Times New Roman" w:cs="Times New Roman"/>
+                <w:sz w:val="24"/>
+                <w:szCs w:val="24"/>
+              </w:rPr>
             </w:r>
           </w:p>
           <w:p>
             <w:pPr>
+              <w:pBdr/>
               <w:spacing w:after="40"/>
               <w:ind w:left="216"/>
+              <w:rPr>
+                <w:rFonts w:ascii="Times New Roman" w:hAnsi="Times New Roman" w:cs="Times New Roman"/>
+                <w:sz w:val="24"/>
+                <w:szCs w:val="24"/>
+              </w:rPr>
             </w:pPr>
             <w:r>
               <w:rPr>
-                <w:rFonts w:ascii="Arial" w:hAnsi="Arial"/>
+                <w:rFonts w:ascii="Times New Roman" w:hAnsi="Times New Roman" w:eastAsia="Times New Roman" w:cs="Times New Roman"/>
                 <w:b/>
-                <w:sz w:val="20"/>
+                <w:sz w:val="24"/>
+                <w:szCs w:val="24"/>
               </w:rPr>
               <w:t xml:space="preserve">• </w:t>
             </w:r>
             <w:r>
               <w:rPr>
-                <w:rFonts w:ascii="Arial" w:hAnsi="Arial"/>
-                <w:sz w:val="20"/>
+                <w:rFonts w:ascii="Times New Roman" w:hAnsi="Times New Roman" w:eastAsia="Times New Roman" w:cs="Times New Roman"/>
+                <w:sz w:val="24"/>
+                <w:szCs w:val="24"/>
               </w:rPr>
-              <w:t>Aprender a calcular el tiempo real de estudio independiente según los créditos de cada materia.</w:t>
+              <w:t xml:space="preserve">Aprender a calcular el tiempo real de estudio independiente según los créditos de cada materia.</w:t>
+            </w:r>
+            <w:r>
+              <w:rPr>
+                <w:rFonts w:ascii="Times New Roman" w:hAnsi="Times New Roman" w:eastAsia="Times New Roman" w:cs="Times New Roman"/>
+                <w:sz w:val="24"/>
+                <w:szCs w:val="24"/>
+              </w:rPr>
             </w:r>
           </w:p>
           <w:p>
             <w:pPr>
+              <w:pBdr/>
               <w:spacing w:after="40"/>
               <w:ind w:left="216"/>
+              <w:rPr>
+                <w:rFonts w:ascii="Times New Roman" w:hAnsi="Times New Roman" w:cs="Times New Roman"/>
+                <w:sz w:val="24"/>
+                <w:szCs w:val="24"/>
+              </w:rPr>
             </w:pPr>
             <w:r>
               <w:rPr>
-                <w:rFonts w:ascii="Arial" w:hAnsi="Arial"/>
+                <w:rFonts w:ascii="Times New Roman" w:hAnsi="Times New Roman" w:eastAsia="Times New Roman" w:cs="Times New Roman"/>
                 <w:b/>
-                <w:sz w:val="20"/>
+                <w:sz w:val="24"/>
+                <w:szCs w:val="24"/>
               </w:rPr>
               <w:t xml:space="preserve">• </w:t>
             </w:r>
             <w:r>
               <w:rPr>
-                <w:rFonts w:ascii="Arial" w:hAnsi="Arial"/>
+                <w:rFonts w:ascii="Times New Roman" w:hAnsi="Times New Roman" w:eastAsia="Times New Roman" w:cs="Times New Roman"/>
                 <w:b/>
-                <w:sz w:val="20"/>
+                <w:sz w:val="24"/>
+                <w:szCs w:val="24"/>
               </w:rPr>
-              <w:t>Tener claro el papel del tutor los sábados:</w:t>
+              <w:t xml:space="preserve">Tener claro el papel del tutor los sábados:</w:t>
             </w:r>
             <w:r>
               <w:rPr>
-                <w:rFonts w:ascii="Arial" w:hAnsi="Arial"/>
-                <w:sz w:val="20"/>
+                <w:rFonts w:ascii="Times New Roman" w:hAnsi="Times New Roman" w:eastAsia="Times New Roman" w:cs="Times New Roman"/>
+                <w:sz w:val="24"/>
+                <w:szCs w:val="24"/>
               </w:rPr>
               <w:t xml:space="preserve"> resolver dudas de fondo y validar conceptos, no dar una clase magistral desde cero.</w:t>
+            </w:r>
+            <w:r>
+              <w:rPr>
+                <w:rFonts w:ascii="Times New Roman" w:hAnsi="Times New Roman" w:eastAsia="Times New Roman" w:cs="Times New Roman"/>
+                <w:sz w:val="24"/>
+                <w:szCs w:val="24"/>
+              </w:rPr>
             </w:r>
           </w:p>
         </w:tc>
@@ -339,190 +621,310 @@
           </w:tcPr>
           <w:p>
             <w:pPr>
+              <w:pBdr/>
               <w:spacing w:after="60"/>
+              <w:ind/>
+              <w:rPr>
+                <w:rFonts w:ascii="Times New Roman" w:hAnsi="Times New Roman" w:cs="Times New Roman"/>
+                <w:sz w:val="24"/>
+                <w:szCs w:val="24"/>
+              </w:rPr>
             </w:pPr>
-            <w:r/>
             <w:r>
               <w:rPr>
-                <w:rFonts w:ascii="Arial" w:hAnsi="Arial"/>
+                <w:rFonts w:ascii="Times New Roman" w:hAnsi="Times New Roman" w:eastAsia="Times New Roman" w:cs="Times New Roman"/>
                 <w:b/>
-                <w:sz w:val="22"/>
+                <w:sz w:val="24"/>
+                <w:szCs w:val="24"/>
               </w:rPr>
-              <w:t>Conceptos claves y definiciones:</w:t>
+              <w:t xml:space="preserve">Conceptos claves y definiciones:</w:t>
+            </w:r>
+            <w:r>
+              <w:rPr>
+                <w:rFonts w:ascii="Times New Roman" w:hAnsi="Times New Roman" w:eastAsia="Times New Roman" w:cs="Times New Roman"/>
+                <w:sz w:val="24"/>
+                <w:szCs w:val="24"/>
+              </w:rPr>
             </w:r>
           </w:p>
           <w:p>
             <w:pPr>
+              <w:pBdr/>
               <w:spacing w:after="40"/>
               <w:ind w:left="216"/>
+              <w:rPr>
+                <w:rFonts w:ascii="Times New Roman" w:hAnsi="Times New Roman" w:cs="Times New Roman"/>
+                <w:sz w:val="24"/>
+                <w:szCs w:val="24"/>
+              </w:rPr>
             </w:pPr>
             <w:r>
               <w:rPr>
-                <w:rFonts w:ascii="Arial" w:hAnsi="Arial"/>
+                <w:rFonts w:ascii="Times New Roman" w:hAnsi="Times New Roman" w:eastAsia="Times New Roman" w:cs="Times New Roman"/>
                 <w:b/>
-                <w:sz w:val="20"/>
+                <w:sz w:val="24"/>
+                <w:szCs w:val="24"/>
               </w:rPr>
               <w:t xml:space="preserve">• </w:t>
             </w:r>
             <w:r>
               <w:rPr>
-                <w:rFonts w:ascii="Arial" w:hAnsi="Arial"/>
+                <w:rFonts w:ascii="Times New Roman" w:hAnsi="Times New Roman" w:eastAsia="Times New Roman" w:cs="Times New Roman"/>
                 <w:b/>
-                <w:sz w:val="20"/>
+                <w:sz w:val="24"/>
+                <w:szCs w:val="24"/>
               </w:rPr>
-              <w:t>Momentos del aprendizaje:</w:t>
+              <w:t xml:space="preserve">Momentos del aprendizaje:</w:t>
             </w:r>
             <w:r>
               <w:rPr>
-                <w:rFonts w:ascii="Arial" w:hAnsi="Arial"/>
-                <w:sz w:val="20"/>
+                <w:rFonts w:ascii="Times New Roman" w:hAnsi="Times New Roman" w:eastAsia="Times New Roman" w:cs="Times New Roman"/>
+                <w:sz w:val="24"/>
+                <w:szCs w:val="24"/>
               </w:rPr>
               <w:t xml:space="preserve"> Las tres etapas que estructuran el estudio a distancia en la UDC: primero el trabajo individual, luego el debate en equipo (CIPAS) y finalmente la tutoría con el profesor.</w:t>
+            </w:r>
+            <w:r>
+              <w:rPr>
+                <w:rFonts w:ascii="Times New Roman" w:hAnsi="Times New Roman" w:eastAsia="Times New Roman" w:cs="Times New Roman"/>
+                <w:sz w:val="24"/>
+                <w:szCs w:val="24"/>
+              </w:rPr>
             </w:r>
           </w:p>
           <w:p>
             <w:pPr>
+              <w:pBdr/>
               <w:spacing w:after="40"/>
               <w:ind w:left="216"/>
+              <w:rPr>
+                <w:rFonts w:ascii="Times New Roman" w:hAnsi="Times New Roman" w:cs="Times New Roman"/>
+                <w:sz w:val="24"/>
+                <w:szCs w:val="24"/>
+              </w:rPr>
             </w:pPr>
             <w:r>
               <w:rPr>
-                <w:rFonts w:ascii="Arial" w:hAnsi="Arial"/>
+                <w:rFonts w:ascii="Times New Roman" w:hAnsi="Times New Roman" w:eastAsia="Times New Roman" w:cs="Times New Roman"/>
                 <w:b/>
-                <w:sz w:val="20"/>
+                <w:sz w:val="24"/>
+                <w:szCs w:val="24"/>
               </w:rPr>
               <w:t xml:space="preserve">• </w:t>
             </w:r>
             <w:r>
               <w:rPr>
-                <w:rFonts w:ascii="Arial" w:hAnsi="Arial"/>
+                <w:rFonts w:ascii="Times New Roman" w:hAnsi="Times New Roman" w:eastAsia="Times New Roman" w:cs="Times New Roman"/>
                 <w:b/>
-                <w:sz w:val="20"/>
+                <w:sz w:val="24"/>
+                <w:szCs w:val="24"/>
               </w:rPr>
-              <w:t>Co-validación (Lora Sfer, 2014):</w:t>
+              <w:t xml:space="preserve">Co-validación</w:t>
             </w:r>
             <w:r>
               <w:rPr>
-                <w:rFonts w:ascii="Arial" w:hAnsi="Arial"/>
-                <w:sz w:val="20"/>
+                <w:rFonts w:ascii="Times New Roman" w:hAnsi="Times New Roman" w:eastAsia="Times New Roman" w:cs="Times New Roman"/>
+                <w:b/>
+                <w:sz w:val="24"/>
+                <w:szCs w:val="24"/>
+                <w:lang w:val="es-ES"/>
+              </w:rPr>
+              <w:t xml:space="preserve">:</w:t>
+            </w:r>
+            <w:r>
+              <w:rPr>
+                <w:rFonts w:ascii="Times New Roman" w:hAnsi="Times New Roman" w:eastAsia="Times New Roman" w:cs="Times New Roman"/>
+                <w:sz w:val="24"/>
+                <w:szCs w:val="24"/>
               </w:rPr>
               <w:t xml:space="preserve"> Proceso en el que uno pone a prueba lo que entendió, primero con los compañeros de CIPAS y luego con el tutor, para corregir errores y fijar bien los conceptos.</w:t>
+            </w:r>
+            <w:r>
+              <w:rPr>
+                <w:rFonts w:ascii="Times New Roman" w:hAnsi="Times New Roman" w:eastAsia="Times New Roman" w:cs="Times New Roman"/>
+                <w:sz w:val="24"/>
+                <w:szCs w:val="24"/>
+              </w:rPr>
             </w:r>
           </w:p>
           <w:p>
             <w:pPr>
+              <w:pBdr/>
               <w:spacing w:after="40"/>
               <w:ind w:left="216"/>
+              <w:rPr>
+                <w:rFonts w:ascii="Times New Roman" w:hAnsi="Times New Roman" w:cs="Times New Roman"/>
+                <w:sz w:val="24"/>
+                <w:szCs w:val="24"/>
+              </w:rPr>
             </w:pPr>
             <w:r>
               <w:rPr>
-                <w:rFonts w:ascii="Arial" w:hAnsi="Arial"/>
+                <w:rFonts w:ascii="Times New Roman" w:hAnsi="Times New Roman" w:eastAsia="Times New Roman" w:cs="Times New Roman"/>
                 <w:b/>
-                <w:sz w:val="20"/>
+                <w:sz w:val="24"/>
+                <w:szCs w:val="24"/>
               </w:rPr>
               <w:t xml:space="preserve">• </w:t>
             </w:r>
             <w:r>
               <w:rPr>
-                <w:rFonts w:ascii="Arial" w:hAnsi="Arial"/>
+                <w:rFonts w:ascii="Times New Roman" w:hAnsi="Times New Roman" w:eastAsia="Times New Roman" w:cs="Times New Roman"/>
                 <w:b/>
-                <w:sz w:val="20"/>
+                <w:sz w:val="24"/>
+                <w:szCs w:val="24"/>
               </w:rPr>
-              <w:t>Carácter dialéctico:</w:t>
+              <w:t xml:space="preserve">Carácter dialéctico:</w:t>
             </w:r>
             <w:r>
               <w:rPr>
-                <w:rFonts w:ascii="Arial" w:hAnsi="Arial"/>
-                <w:sz w:val="20"/>
+                <w:rFonts w:ascii="Times New Roman" w:hAnsi="Times New Roman" w:eastAsia="Times New Roman" w:cs="Times New Roman"/>
+                <w:sz w:val="24"/>
+                <w:szCs w:val="24"/>
               </w:rPr>
               <w:t xml:space="preserve"> Significa que las tres etapas están amarradas entre sí; el trabajo individual alimenta al CIPAS, y las conclusiones del grupo preparan la tutoría del sábado.</w:t>
+            </w:r>
+            <w:r>
+              <w:rPr>
+                <w:rFonts w:ascii="Times New Roman" w:hAnsi="Times New Roman" w:eastAsia="Times New Roman" w:cs="Times New Roman"/>
+                <w:sz w:val="24"/>
+                <w:szCs w:val="24"/>
+              </w:rPr>
             </w:r>
           </w:p>
           <w:p>
             <w:pPr>
+              <w:pBdr/>
               <w:spacing w:after="40"/>
               <w:ind w:left="216"/>
+              <w:rPr>
+                <w:rFonts w:ascii="Times New Roman" w:hAnsi="Times New Roman" w:cs="Times New Roman"/>
+                <w:sz w:val="24"/>
+                <w:szCs w:val="24"/>
+              </w:rPr>
             </w:pPr>
             <w:r>
               <w:rPr>
-                <w:rFonts w:ascii="Arial" w:hAnsi="Arial"/>
+                <w:rFonts w:ascii="Times New Roman" w:hAnsi="Times New Roman" w:eastAsia="Times New Roman" w:cs="Times New Roman"/>
                 <w:b/>
-                <w:sz w:val="20"/>
+                <w:sz w:val="24"/>
+                <w:szCs w:val="24"/>
               </w:rPr>
               <w:t xml:space="preserve">• </w:t>
             </w:r>
             <w:r>
               <w:rPr>
-                <w:rFonts w:ascii="Arial" w:hAnsi="Arial"/>
+                <w:rFonts w:ascii="Times New Roman" w:hAnsi="Times New Roman" w:eastAsia="Times New Roman" w:cs="Times New Roman"/>
                 <w:b/>
-                <w:sz w:val="20"/>
+                <w:sz w:val="24"/>
+                <w:szCs w:val="24"/>
               </w:rPr>
-              <w:t>Estrategias metacognitivas:</w:t>
+              <w:t xml:space="preserve">Estrategias metacognitivas:</w:t>
             </w:r>
             <w:r>
               <w:rPr>
-                <w:rFonts w:ascii="Arial" w:hAnsi="Arial"/>
-                <w:sz w:val="20"/>
+                <w:rFonts w:ascii="Times New Roman" w:hAnsi="Times New Roman" w:eastAsia="Times New Roman" w:cs="Times New Roman"/>
+                <w:sz w:val="24"/>
+                <w:szCs w:val="24"/>
               </w:rPr>
               <w:t xml:space="preserve"> La capacidad de darse cuenta de cómo aprende uno mismo, identificando qué temas están flojos y ajustando el método antes de la entrega o el examen.</w:t>
+            </w:r>
+            <w:r>
+              <w:rPr>
+                <w:rFonts w:ascii="Times New Roman" w:hAnsi="Times New Roman" w:eastAsia="Times New Roman" w:cs="Times New Roman"/>
+                <w:sz w:val="24"/>
+                <w:szCs w:val="24"/>
+              </w:rPr>
             </w:r>
           </w:p>
           <w:p>
             <w:pPr>
+              <w:pBdr/>
               <w:spacing w:after="40"/>
               <w:ind w:left="216"/>
+              <w:rPr>
+                <w:rFonts w:ascii="Times New Roman" w:hAnsi="Times New Roman" w:cs="Times New Roman"/>
+                <w:sz w:val="24"/>
+                <w:szCs w:val="24"/>
+              </w:rPr>
             </w:pPr>
             <w:r>
               <w:rPr>
-                <w:rFonts w:ascii="Arial" w:hAnsi="Arial"/>
+                <w:rFonts w:ascii="Times New Roman" w:hAnsi="Times New Roman" w:eastAsia="Times New Roman" w:cs="Times New Roman"/>
                 <w:b/>
-                <w:sz w:val="20"/>
+                <w:sz w:val="24"/>
+                <w:szCs w:val="24"/>
               </w:rPr>
               <w:t xml:space="preserve">• </w:t>
             </w:r>
             <w:r>
               <w:rPr>
-                <w:rFonts w:ascii="Arial" w:hAnsi="Arial"/>
+                <w:rFonts w:ascii="Times New Roman" w:hAnsi="Times New Roman" w:eastAsia="Times New Roman" w:cs="Times New Roman"/>
                 <w:b/>
-                <w:sz w:val="20"/>
+                <w:sz w:val="24"/>
+                <w:szCs w:val="24"/>
               </w:rPr>
-              <w:t>Crédito académico:</w:t>
+              <w:t xml:space="preserve">Crédito académico:</w:t>
             </w:r>
             <w:r>
               <w:rPr>
-                <w:rFonts w:ascii="Arial" w:hAnsi="Arial"/>
-                <w:sz w:val="20"/>
+                <w:rFonts w:ascii="Times New Roman" w:hAnsi="Times New Roman" w:eastAsia="Times New Roman" w:cs="Times New Roman"/>
+                <w:sz w:val="24"/>
+                <w:szCs w:val="24"/>
               </w:rPr>
               <w:t xml:space="preserve"> Equivale a 48 horas de trabajo del estudiante por semestre. En la modalidad a distancia, cada crédito exige dedicarle entre 2 y 3 horas semanales de estudio por cuenta propia, aparte de las tutorías de los sábados.</w:t>
+            </w:r>
+            <w:r>
+              <w:rPr>
+                <w:rFonts w:ascii="Times New Roman" w:hAnsi="Times New Roman" w:eastAsia="Times New Roman" w:cs="Times New Roman"/>
+                <w:sz w:val="24"/>
+                <w:szCs w:val="24"/>
+              </w:rPr>
             </w:r>
           </w:p>
           <w:p>
             <w:pPr>
+              <w:pBdr/>
               <w:spacing w:after="40"/>
               <w:ind w:left="216"/>
+              <w:rPr>
+                <w:rFonts w:ascii="Times New Roman" w:hAnsi="Times New Roman" w:cs="Times New Roman"/>
+                <w:sz w:val="24"/>
+                <w:szCs w:val="24"/>
+              </w:rPr>
             </w:pPr>
             <w:r>
               <w:rPr>
-                <w:rFonts w:ascii="Arial" w:hAnsi="Arial"/>
+                <w:rFonts w:ascii="Times New Roman" w:hAnsi="Times New Roman" w:eastAsia="Times New Roman" w:cs="Times New Roman"/>
                 <w:b/>
-                <w:sz w:val="20"/>
+                <w:sz w:val="24"/>
+                <w:szCs w:val="24"/>
               </w:rPr>
               <w:t xml:space="preserve">• </w:t>
             </w:r>
             <w:r>
               <w:rPr>
-                <w:rFonts w:ascii="Arial" w:hAnsi="Arial"/>
+                <w:rFonts w:ascii="Times New Roman" w:hAnsi="Times New Roman" w:eastAsia="Times New Roman" w:cs="Times New Roman"/>
                 <w:b/>
-                <w:sz w:val="20"/>
+                <w:sz w:val="24"/>
+                <w:szCs w:val="24"/>
               </w:rPr>
-              <w:t>Autorregulación del tiempo:</w:t>
+              <w:t xml:space="preserve">Autorregulación del tiempo:</w:t>
             </w:r>
             <w:r>
               <w:rPr>
-                <w:rFonts w:ascii="Arial" w:hAnsi="Arial"/>
-                <w:sz w:val="20"/>
+                <w:rFonts w:ascii="Times New Roman" w:hAnsi="Times New Roman" w:eastAsia="Times New Roman" w:cs="Times New Roman"/>
+                <w:sz w:val="24"/>
+                <w:szCs w:val="24"/>
               </w:rPr>
               <w:t xml:space="preserve"> La disciplina de fijar un horario de estudio semanal y cumplirlo sin necesidad de que nadie esté encima presionando.</w:t>
+            </w:r>
+            <w:r>
+              <w:rPr>
+                <w:rFonts w:ascii="Times New Roman" w:hAnsi="Times New Roman" w:eastAsia="Times New Roman" w:cs="Times New Roman"/>
+                <w:sz w:val="24"/>
+                <w:szCs w:val="24"/>
+              </w:rPr>
             </w:r>
           </w:p>
         </w:tc>
@@ -538,52 +940,382 @@
           </w:tcPr>
           <w:p>
             <w:pPr>
+              <w:pBdr/>
               <w:spacing w:after="60"/>
+              <w:ind/>
+              <w:rPr>
+                <w:rFonts w:ascii="Times New Roman" w:hAnsi="Times New Roman" w:cs="Times New Roman"/>
+                <w:sz w:val="24"/>
+                <w:szCs w:val="24"/>
+              </w:rPr>
             </w:pPr>
-            <w:r/>
             <w:r>
               <w:rPr>
-                <w:rFonts w:ascii="Arial" w:hAnsi="Arial"/>
+                <w:rFonts w:ascii="Times New Roman" w:hAnsi="Times New Roman" w:eastAsia="Times New Roman" w:cs="Times New Roman"/>
                 <w:b/>
-                <w:sz w:val="22"/>
+                <w:sz w:val="24"/>
+                <w:szCs w:val="24"/>
               </w:rPr>
-              <w:t>Resumen de la(as) lecturas:</w:t>
+              <w:t xml:space="preserve">Resumen de la(as) lecturas:</w:t>
+            </w:r>
+            <w:r>
+              <w:rPr>
+                <w:rFonts w:ascii="Times New Roman" w:hAnsi="Times New Roman" w:eastAsia="Times New Roman" w:cs="Times New Roman"/>
+                <w:sz w:val="24"/>
+                <w:szCs w:val="24"/>
+              </w:rPr>
             </w:r>
           </w:p>
           <w:p>
             <w:pPr>
+              <w:pBdr/>
               <w:spacing w:after="60" w:line="276" w:lineRule="auto"/>
+              <w:ind/>
+              <w:rPr>
+                <w:rFonts w:ascii="Times New Roman" w:hAnsi="Times New Roman" w:cs="Times New Roman"/>
+                <w:sz w:val="24"/>
+                <w:szCs w:val="24"/>
+              </w:rPr>
             </w:pPr>
             <w:r>
               <w:rPr>
-                <w:rFonts w:ascii="Arial" w:hAnsi="Arial"/>
-                <w:sz w:val="20"/>
+                <w:rFonts w:ascii="Times New Roman" w:hAnsi="Times New Roman" w:eastAsia="Times New Roman" w:cs="Times New Roman"/>
+                <w:sz w:val="24"/>
+                <w:szCs w:val="24"/>
               </w:rPr>
-              <w:t>El módulo de la Unidad 2 explica la lógica con la que funciona la educación a distancia en la Universidad de Cartagena. Estudiar a distancia no es simplemente descargar guías y entregarlas el día del plazo; es un ciclo continuo que se mueve entre tres momentos que dependen directamente uno del otro.</w:t>
+              <w:t xml:space="preserve">El módulo de la Unidad 2 explica</w:t>
+            </w:r>
+            <w:r>
+              <w:rPr>
+                <w:rFonts w:ascii="Times New Roman" w:hAnsi="Times New Roman" w:eastAsia="Times New Roman" w:cs="Times New Roman"/>
+                <w:sz w:val="24"/>
+                <w:szCs w:val="24"/>
+                <w:lang w:val="es-ES"/>
+              </w:rPr>
+              <w:t xml:space="preserve"> bastante bien</w:t>
+            </w:r>
+            <w:r>
+              <w:rPr>
+                <w:rFonts w:ascii="Times New Roman" w:hAnsi="Times New Roman" w:eastAsia="Times New Roman" w:cs="Times New Roman"/>
+                <w:sz w:val="24"/>
+                <w:szCs w:val="24"/>
+              </w:rPr>
+              <w:t xml:space="preserve"> la lógica c</w:t>
+            </w:r>
+            <w:r>
+              <w:rPr>
+                <w:rFonts w:ascii="Times New Roman" w:hAnsi="Times New Roman" w:eastAsia="Times New Roman" w:cs="Times New Roman"/>
+                <w:sz w:val="24"/>
+                <w:szCs w:val="24"/>
+              </w:rPr>
+              <w:t xml:space="preserve">on la que funciona la educación a distancia en la Universidad de Cartagena. Estudiar a distancia no es simplemente descargar guías y entregarlas el día del plazo</w:t>
+            </w:r>
+            <w:r>
+              <w:rPr>
+                <w:rFonts w:ascii="Times New Roman" w:hAnsi="Times New Roman" w:eastAsia="Times New Roman" w:cs="Times New Roman"/>
+                <w:sz w:val="24"/>
+                <w:szCs w:val="24"/>
+                <w:lang w:val="es-ES"/>
+              </w:rPr>
+              <w:t xml:space="preserve">,</w:t>
+            </w:r>
+            <w:r>
+              <w:rPr>
+                <w:rFonts w:ascii="Times New Roman" w:hAnsi="Times New Roman" w:eastAsia="Times New Roman" w:cs="Times New Roman"/>
+                <w:sz w:val="24"/>
+                <w:szCs w:val="24"/>
+              </w:rPr>
+              <w:t xml:space="preserve"> es</w:t>
+            </w:r>
+            <w:r>
+              <w:rPr>
+                <w:rFonts w:ascii="Times New Roman" w:hAnsi="Times New Roman" w:eastAsia="Times New Roman" w:cs="Times New Roman"/>
+                <w:sz w:val="24"/>
+                <w:szCs w:val="24"/>
+                <w:lang w:val="es-ES"/>
+              </w:rPr>
+              <w:t xml:space="preserve"> más bien</w:t>
+            </w:r>
+            <w:r>
+              <w:rPr>
+                <w:rFonts w:ascii="Times New Roman" w:hAnsi="Times New Roman" w:eastAsia="Times New Roman" w:cs="Times New Roman"/>
+                <w:sz w:val="24"/>
+                <w:szCs w:val="24"/>
+              </w:rPr>
+              <w:t xml:space="preserve"> un ciclo continuo que se mueve entre tres momentos que dependen directamente uno del otro.</w:t>
+            </w:r>
+            <w:r>
+              <w:rPr>
+                <w:rFonts w:ascii="Times New Roman" w:hAnsi="Times New Roman" w:eastAsia="Times New Roman" w:cs="Times New Roman"/>
+                <w:sz w:val="24"/>
+                <w:szCs w:val="24"/>
+              </w:rPr>
             </w:r>
           </w:p>
           <w:p>
             <w:pPr>
+              <w:pBdr/>
               <w:spacing w:after="60" w:line="276" w:lineRule="auto"/>
+              <w:ind/>
+              <w:rPr>
+                <w:rFonts w:ascii="Times New Roman" w:hAnsi="Times New Roman" w:cs="Times New Roman"/>
+                <w:sz w:val="24"/>
+                <w:szCs w:val="24"/>
+              </w:rPr>
             </w:pPr>
             <w:r>
               <w:rPr>
-                <w:rFonts w:ascii="Arial" w:hAnsi="Arial"/>
-                <w:sz w:val="20"/>
+                <w:rFonts w:ascii="Times New Roman" w:hAnsi="Times New Roman" w:eastAsia="Times New Roman" w:cs="Times New Roman"/>
+                <w:sz w:val="24"/>
+                <w:szCs w:val="24"/>
               </w:rPr>
-              <w:t>Amaury Lora Sfer lo deja muy claro: el primer momento es el estudio individual. No se trata de aislarse del mundo, sino de leer el módulo, investigar por cuenta propia, tomar apuntes y armar el protocolo individual. De ahí pasamos al segundo momento, que son los CIPAS. Aquí es donde nos sentamos con el equipo a comparar lo que entendió cada uno, debatir diferencias y redactar el protocolo colaborativo. El autor es tajante en esto: el trabajo en grupo fracasa si los integrantes no leyeron antes por su cuenta. El CIPAS no reemplaza el estudio personal; lo complementa.</w:t>
+              <w:t xml:space="preserve">Amaury Lora Sfer lo deja </w:t>
+            </w:r>
+            <w:r>
+              <w:rPr>
+                <w:rFonts w:ascii="Times New Roman" w:hAnsi="Times New Roman" w:eastAsia="Times New Roman" w:cs="Times New Roman"/>
+                <w:sz w:val="24"/>
+                <w:szCs w:val="24"/>
+                <w:lang w:val="es-ES"/>
+              </w:rPr>
+              <w:t xml:space="preserve">bastante</w:t>
+            </w:r>
+            <w:r>
+              <w:rPr>
+                <w:rFonts w:ascii="Times New Roman" w:hAnsi="Times New Roman" w:eastAsia="Times New Roman" w:cs="Times New Roman"/>
+                <w:sz w:val="24"/>
+                <w:szCs w:val="24"/>
+                <w:lang w:val="es-ES"/>
+              </w:rPr>
+              <w:t xml:space="preserve"> </w:t>
+            </w:r>
+            <w:r>
+              <w:rPr>
+                <w:rFonts w:ascii="Times New Roman" w:hAnsi="Times New Roman" w:eastAsia="Times New Roman" w:cs="Times New Roman"/>
+                <w:sz w:val="24"/>
+                <w:szCs w:val="24"/>
+              </w:rPr>
+              <w:t xml:space="preserve">claro</w:t>
+            </w:r>
+            <w:r>
+              <w:rPr>
+                <w:rFonts w:ascii="Times New Roman" w:hAnsi="Times New Roman" w:eastAsia="Times New Roman" w:cs="Times New Roman"/>
+                <w:sz w:val="24"/>
+                <w:szCs w:val="24"/>
+                <w:lang w:val="es-ES"/>
+              </w:rPr>
+              <w:t xml:space="preserve">,</w:t>
+            </w:r>
+            <w:r>
+              <w:rPr>
+                <w:rFonts w:ascii="Times New Roman" w:hAnsi="Times New Roman" w:eastAsia="Times New Roman" w:cs="Times New Roman"/>
+                <w:sz w:val="24"/>
+                <w:szCs w:val="24"/>
+              </w:rPr>
+              <w:t xml:space="preserve"> el primer momento es el </w:t>
+            </w:r>
+            <w:r>
+              <w:rPr>
+                <w:rFonts w:ascii="Times New Roman" w:hAnsi="Times New Roman" w:eastAsia="Times New Roman" w:cs="Times New Roman"/>
+                <w:sz w:val="24"/>
+                <w:szCs w:val="24"/>
+              </w:rPr>
+              <w:t xml:space="preserve">estudio individual. No se trata de aislarse del mundo, sino de leer el módulo, investigar por cuenta propia, tomar apuntes y armar el protocolo individual. De ahí pasamos al segundo momento, que son los CIPAS. Aquí es donde nos sentamos con el equipo a com</w:t>
+            </w:r>
+            <w:r>
+              <w:rPr>
+                <w:rFonts w:ascii="Times New Roman" w:hAnsi="Times New Roman" w:eastAsia="Times New Roman" w:cs="Times New Roman"/>
+                <w:sz w:val="24"/>
+                <w:szCs w:val="24"/>
+              </w:rPr>
+              <w:t xml:space="preserve">parar lo que entendió cada uno, debatir diferencias y redactar el protocolo colaborativo. El autor es </w:t>
+            </w:r>
+            <w:r>
+              <w:rPr>
+                <w:rFonts w:ascii="Times New Roman" w:hAnsi="Times New Roman" w:eastAsia="Times New Roman" w:cs="Times New Roman"/>
+                <w:sz w:val="24"/>
+                <w:szCs w:val="24"/>
+                <w:lang w:val="es-ES"/>
+              </w:rPr>
+              <w:t xml:space="preserve">estricto</w:t>
+            </w:r>
+            <w:r>
+              <w:rPr>
+                <w:rFonts w:ascii="Times New Roman" w:hAnsi="Times New Roman" w:eastAsia="Times New Roman" w:cs="Times New Roman"/>
+                <w:sz w:val="24"/>
+                <w:szCs w:val="24"/>
+                <w:lang w:val="es-ES"/>
+              </w:rPr>
+              <w:t xml:space="preserve"> </w:t>
+            </w:r>
+            <w:r>
+              <w:rPr>
+                <w:rFonts w:ascii="Times New Roman" w:hAnsi="Times New Roman" w:eastAsia="Times New Roman" w:cs="Times New Roman"/>
+                <w:sz w:val="24"/>
+                <w:szCs w:val="24"/>
+              </w:rPr>
+              <w:t xml:space="preserve">en esto</w:t>
+            </w:r>
+            <w:r>
+              <w:rPr>
+                <w:rFonts w:ascii="Times New Roman" w:hAnsi="Times New Roman" w:eastAsia="Times New Roman" w:cs="Times New Roman"/>
+                <w:sz w:val="24"/>
+                <w:szCs w:val="24"/>
+                <w:lang w:val="es-ES"/>
+              </w:rPr>
+              <w:t xml:space="preserve">,</w:t>
+            </w:r>
+            <w:r>
+              <w:rPr>
+                <w:rFonts w:ascii="Times New Roman" w:hAnsi="Times New Roman" w:eastAsia="Times New Roman" w:cs="Times New Roman"/>
+                <w:sz w:val="24"/>
+                <w:szCs w:val="24"/>
+              </w:rPr>
+              <w:t xml:space="preserve"> el trabajo en grupo fracasa si los integrantes no </w:t>
+            </w:r>
+            <w:r>
+              <w:rPr>
+                <w:rFonts w:ascii="Times New Roman" w:hAnsi="Times New Roman" w:eastAsia="Times New Roman" w:cs="Times New Roman"/>
+                <w:sz w:val="24"/>
+                <w:szCs w:val="24"/>
+                <w:lang w:val="es-ES"/>
+              </w:rPr>
+              <w:t xml:space="preserve">estudian</w:t>
+            </w:r>
+            <w:r>
+              <w:rPr>
+                <w:rFonts w:ascii="Times New Roman" w:hAnsi="Times New Roman" w:eastAsia="Times New Roman" w:cs="Times New Roman"/>
+                <w:sz w:val="24"/>
+                <w:szCs w:val="24"/>
+                <w:lang w:val="es-ES"/>
+              </w:rPr>
+              <w:t xml:space="preserve"> </w:t>
+            </w:r>
+            <w:r>
+              <w:rPr>
+                <w:rFonts w:ascii="Times New Roman" w:hAnsi="Times New Roman" w:eastAsia="Times New Roman" w:cs="Times New Roman"/>
+                <w:sz w:val="24"/>
+                <w:szCs w:val="24"/>
+              </w:rPr>
+              <w:t xml:space="preserve">antes por su cuenta. El CIPAS no reemplaza el estudio personal</w:t>
+            </w:r>
+            <w:r>
+              <w:rPr>
+                <w:rFonts w:ascii="Times New Roman" w:hAnsi="Times New Roman" w:eastAsia="Times New Roman" w:cs="Times New Roman"/>
+                <w:sz w:val="24"/>
+                <w:szCs w:val="24"/>
+                <w:lang w:val="es-ES"/>
+              </w:rPr>
+              <w:t xml:space="preserve">,</w:t>
+            </w:r>
+            <w:r>
+              <w:rPr>
+                <w:rFonts w:ascii="Times New Roman" w:hAnsi="Times New Roman" w:eastAsia="Times New Roman" w:cs="Times New Roman"/>
+                <w:sz w:val="24"/>
+                <w:szCs w:val="24"/>
+              </w:rPr>
+              <w:t xml:space="preserve"> lo complementa.</w:t>
+            </w:r>
+            <w:r>
+              <w:rPr>
+                <w:rFonts w:ascii="Times New Roman" w:hAnsi="Times New Roman" w:eastAsia="Times New Roman" w:cs="Times New Roman"/>
+                <w:sz w:val="24"/>
+                <w:szCs w:val="24"/>
+              </w:rPr>
             </w:r>
           </w:p>
           <w:p>
             <w:pPr>
+              <w:pBdr/>
               <w:spacing w:after="60" w:line="276" w:lineRule="auto"/>
+              <w:ind/>
+              <w:rPr>
+                <w:rFonts w:ascii="Times New Roman" w:hAnsi="Times New Roman" w:cs="Times New Roman"/>
+                <w:sz w:val="24"/>
+                <w:szCs w:val="24"/>
+              </w:rPr>
             </w:pPr>
             <w:r>
               <w:rPr>
-                <w:rFonts w:ascii="Arial" w:hAnsi="Arial"/>
-                <w:sz w:val="20"/>
+                <w:rFonts w:ascii="Times New Roman" w:hAnsi="Times New Roman" w:eastAsia="Times New Roman" w:cs="Times New Roman"/>
+                <w:sz w:val="24"/>
+                <w:szCs w:val="24"/>
               </w:rPr>
-              <w:t>El tercer momento ocurre los sábados en la tutoría con el docente. El profesor no llega a dictar una clase tradicional desde cero, sino a liderar la co-validación. Es el espacio para debatir las dudas complejas que el CIPAS no pudo resolver y consolidar el conocimiento. Al final, el autor lanza una advertencia que me parece la más realista de todo el texto: la flexibilidad de horarios ayuda mucho a coordinar la vida diaria, pero no hace milagros por sí sola, porque «quien no estudia, no aprende». Sin disciplina para dedicarle las horas que exige cada crédito académico y sin una lectura juiciosa, es imposible rendir en la carrera.</w:t>
+              <w:t xml:space="preserve">El tercer momento ocurre los sábados en la tutoría con el docente. El profesor no llega a dictar una clase tradicional desde </w:t>
+            </w:r>
+            <w:r>
+              <w:rPr>
+                <w:rFonts w:ascii="Times New Roman" w:hAnsi="Times New Roman" w:eastAsia="Times New Roman" w:cs="Times New Roman"/>
+                <w:sz w:val="24"/>
+                <w:szCs w:val="24"/>
+              </w:rPr>
+              <w:t xml:space="preserve">cero, sino a liderar la co-validación. Es el espacio para debatir las dudas complejas que el CIPAS no pudo resolver y consolidar el conocimiento. Al final, el autor lanza una advertencia que me parece la más realista de todo el texto: la flexibilidad de ho</w:t>
+            </w:r>
+            <w:r>
+              <w:rPr>
+                <w:rFonts w:ascii="Times New Roman" w:hAnsi="Times New Roman" w:eastAsia="Times New Roman" w:cs="Times New Roman"/>
+                <w:sz w:val="24"/>
+                <w:szCs w:val="24"/>
+              </w:rPr>
+              <w:t xml:space="preserve">rarios ayuda mucho a coordinar la vida diaria, pero no hace milagros por sí sola, porque </w:t>
+            </w:r>
+            <w:r>
+              <w:rPr>
+                <w:rFonts w:ascii="Times New Roman" w:hAnsi="Times New Roman" w:eastAsia="Times New Roman" w:cs="Times New Roman"/>
+                <w:sz w:val="24"/>
+                <w:szCs w:val="24"/>
+                <w:lang w:val="es-ES"/>
+              </w:rPr>
+              <w:t xml:space="preserve">“</w:t>
+            </w:r>
+            <w:r>
+              <w:rPr>
+                <w:rFonts w:ascii="Times New Roman" w:hAnsi="Times New Roman" w:eastAsia="Times New Roman" w:cs="Times New Roman"/>
+                <w:sz w:val="24"/>
+                <w:szCs w:val="24"/>
+              </w:rPr>
+              <w:t xml:space="preserve">quien no estudia, no aprende</w:t>
+            </w:r>
+            <w:r>
+              <w:rPr>
+                <w:rFonts w:ascii="Times New Roman" w:hAnsi="Times New Roman" w:eastAsia="Times New Roman" w:cs="Times New Roman"/>
+                <w:sz w:val="24"/>
+                <w:szCs w:val="24"/>
+                <w:lang w:val="es-ES"/>
+              </w:rPr>
+              <w:t xml:space="preserve">”</w:t>
+            </w:r>
+            <w:r>
+              <w:rPr>
+                <w:rFonts w:ascii="Times New Roman" w:hAnsi="Times New Roman" w:eastAsia="Times New Roman" w:cs="Times New Roman"/>
+                <w:sz w:val="24"/>
+                <w:szCs w:val="24"/>
+              </w:rPr>
+              <w:t xml:space="preserve">. Sin disciplina para dedicarle las horas que exige cada </w:t>
+            </w:r>
+            <w:r>
+              <w:rPr>
+                <w:rFonts w:ascii="Times New Roman" w:hAnsi="Times New Roman" w:eastAsia="Times New Roman" w:cs="Times New Roman"/>
+                <w:sz w:val="24"/>
+                <w:szCs w:val="24"/>
+                <w:lang w:val="es-ES"/>
+              </w:rPr>
+              <w:t xml:space="preserve">materia</w:t>
+            </w:r>
+            <w:r>
+              <w:rPr>
+                <w:rFonts w:ascii="Times New Roman" w:hAnsi="Times New Roman" w:eastAsia="Times New Roman" w:cs="Times New Roman"/>
+                <w:sz w:val="24"/>
+                <w:szCs w:val="24"/>
+              </w:rPr>
+              <w:t xml:space="preserve"> y sin una lectura juiciosa, es imposible rendir en la carrera.</w:t>
+            </w:r>
+            <w:r>
+              <w:rPr>
+                <w:rFonts w:ascii="Times New Roman" w:hAnsi="Times New Roman" w:eastAsia="Times New Roman" w:cs="Times New Roman"/>
+                <w:sz w:val="24"/>
+                <w:szCs w:val="24"/>
+              </w:rPr>
             </w:r>
           </w:p>
         </w:tc>
@@ -599,28 +1331,73 @@
           </w:tcPr>
           <w:p>
             <w:pPr>
+              <w:pBdr/>
               <w:spacing w:after="60"/>
+              <w:ind/>
+              <w:rPr>
+                <w:rFonts w:ascii="Times New Roman" w:hAnsi="Times New Roman" w:cs="Times New Roman"/>
+                <w:sz w:val="24"/>
+                <w:szCs w:val="24"/>
+              </w:rPr>
             </w:pPr>
-            <w:r/>
             <w:r>
               <w:rPr>
-                <w:rFonts w:ascii="Arial" w:hAnsi="Arial"/>
+                <w:rFonts w:ascii="Times New Roman" w:hAnsi="Times New Roman" w:eastAsia="Times New Roman" w:cs="Times New Roman"/>
                 <w:b/>
-                <w:sz w:val="22"/>
+                <w:sz w:val="24"/>
+                <w:szCs w:val="24"/>
               </w:rPr>
-              <w:t>Metodología de trabajo:</w:t>
+              <w:t xml:space="preserve">Metodología de trabajo:</w:t>
+            </w:r>
+            <w:r>
+              <w:rPr>
+                <w:rFonts w:ascii="Times New Roman" w:hAnsi="Times New Roman" w:eastAsia="Times New Roman" w:cs="Times New Roman"/>
+                <w:sz w:val="24"/>
+                <w:szCs w:val="24"/>
+              </w:rPr>
             </w:r>
           </w:p>
           <w:p>
             <w:pPr>
+              <w:pBdr/>
               <w:spacing w:after="60" w:line="276" w:lineRule="auto"/>
+              <w:ind/>
+              <w:rPr>
+                <w:rFonts w:ascii="Times New Roman" w:hAnsi="Times New Roman" w:cs="Times New Roman"/>
+                <w:sz w:val="24"/>
+                <w:szCs w:val="24"/>
+              </w:rPr>
             </w:pPr>
             <w:r>
               <w:rPr>
-                <w:rFonts w:ascii="Arial" w:hAnsi="Arial"/>
-                <w:sz w:val="20"/>
+                <w:rFonts w:ascii="Times New Roman" w:hAnsi="Times New Roman" w:eastAsia="Times New Roman" w:cs="Times New Roman"/>
+                <w:sz w:val="24"/>
+                <w:szCs w:val="24"/>
               </w:rPr>
-              <w:t>Descargué el módulo de la Unidad 2 desde la plataforma SIMA y lo leí completo en mi laptop con Linux, resaltando los planteamientos de Amaury Lora Sfer sobre la dinámica de los ciclos tutoriales. Tomé notas en Obsidian para estructurar en limpio la relación entre el trabajo individual, las reuniones de CIPAS y la tutoría presencial. Con base en esos apuntes y revisando mi propio horario de estudio semanal, redacté cada punto de este protocolo con mis propias palabras y reflexiones.</w:t>
+              <w:t xml:space="preserve">Descargué el módulo de la Unidad 2 desde la plataforma y lo leí </w:t>
+            </w:r>
+            <w:r>
+              <w:rPr>
+                <w:rFonts w:ascii="Times New Roman" w:hAnsi="Times New Roman" w:eastAsia="Times New Roman" w:cs="Times New Roman"/>
+                <w:sz w:val="24"/>
+                <w:szCs w:val="24"/>
+                <w:lang w:val="es-ES"/>
+              </w:rPr>
+              <w:t xml:space="preserve">completico, luego hice mis apuntes de la guía en Obsidian, un programa de notas y estudio personal, para tenerlos a la mano para repasar cuando venga la evaluación, finalmente con NotebookLM repaso los aspectos más importantes de la unidad, y me ayuda a estudiar mejor con podcast, flashcards entre otras opciones, para una vez entendido el tema realizar el protocolo individual y colaborativo.</w:t>
+            </w:r>
+            <w:r>
+              <w:rPr>
+                <w:rFonts w:ascii="Times New Roman" w:hAnsi="Times New Roman" w:eastAsia="Times New Roman" w:cs="Times New Roman"/>
+                <w:sz w:val="24"/>
+                <w:szCs w:val="24"/>
+              </w:rPr>
+            </w:r>
+            <w:r>
+              <w:rPr>
+                <w:rFonts w:ascii="Times New Roman" w:hAnsi="Times New Roman" w:eastAsia="Times New Roman" w:cs="Times New Roman"/>
+                <w:sz w:val="24"/>
+                <w:szCs w:val="24"/>
+              </w:rPr>
             </w:r>
           </w:p>
         </w:tc>
@@ -635,28 +1412,116 @@
           </w:tcPr>
           <w:p>
             <w:pPr>
+              <w:pBdr/>
               <w:spacing w:after="60"/>
+              <w:ind/>
+              <w:rPr>
+                <w:rFonts w:ascii="Times New Roman" w:hAnsi="Times New Roman" w:cs="Times New Roman"/>
+                <w:sz w:val="24"/>
+                <w:szCs w:val="24"/>
+              </w:rPr>
             </w:pPr>
-            <w:r/>
             <w:r>
               <w:rPr>
-                <w:rFonts w:ascii="Arial" w:hAnsi="Arial"/>
+                <w:rFonts w:ascii="Times New Roman" w:hAnsi="Times New Roman" w:eastAsia="Times New Roman" w:cs="Times New Roman"/>
                 <w:b/>
-                <w:sz w:val="22"/>
+                <w:sz w:val="24"/>
+                <w:szCs w:val="24"/>
               </w:rPr>
-              <w:t>Conclusiones de la lectura o actividad:</w:t>
+              <w:t xml:space="preserve">Conclusiones de la lectura o actividad:</w:t>
+            </w:r>
+            <w:r>
+              <w:rPr>
+                <w:rFonts w:ascii="Times New Roman" w:hAnsi="Times New Roman" w:eastAsia="Times New Roman" w:cs="Times New Roman"/>
+                <w:sz w:val="24"/>
+                <w:szCs w:val="24"/>
+              </w:rPr>
             </w:r>
           </w:p>
           <w:p>
             <w:pPr>
+              <w:pBdr/>
               <w:spacing w:after="60" w:line="276" w:lineRule="auto"/>
+              <w:ind/>
+              <w:rPr>
+                <w:rFonts w:ascii="Times New Roman" w:hAnsi="Times New Roman" w:cs="Times New Roman"/>
+                <w:sz w:val="24"/>
+                <w:szCs w:val="24"/>
+              </w:rPr>
             </w:pPr>
             <w:r>
               <w:rPr>
-                <w:rFonts w:ascii="Arial" w:hAnsi="Arial"/>
-                <w:sz w:val="20"/>
+                <w:rFonts w:ascii="Times New Roman" w:hAnsi="Times New Roman" w:eastAsia="Times New Roman" w:cs="Times New Roman"/>
+                <w:sz w:val="24"/>
+                <w:szCs w:val="24"/>
               </w:rPr>
-              <w:t>Esta lectura me confirmó que los tres momentos son la base para no perderse en la carrera. Si uno no se toma en serio el estudio individual durante la semana, llega al CIPAS sin nada que aportar y el trabajo en equipo se vuelve una molestia. La verdadera ventaja de esta modalidad está en la co-validación: poder confrontar mis apuntes con el criterio del grupo y del tutor para saber si realmente estoy entendiendo. Además, me quedó claro que tener flexibilidad de horario no es tener tiempo libre para procrastinar, sino la responsabilidad de apartar bloques fijos en la semana para cumplir con las horas que exige cada crédito.</w:t>
+              <w:t xml:space="preserve">Esta lectura me confirmó que los tres momentos son la base para no perderse en la carrera. Si uno no se toma en serio </w:t>
+            </w:r>
+            <w:r>
+              <w:rPr>
+                <w:rFonts w:ascii="Times New Roman" w:hAnsi="Times New Roman" w:eastAsia="Times New Roman" w:cs="Times New Roman"/>
+                <w:sz w:val="24"/>
+                <w:szCs w:val="24"/>
+              </w:rPr>
+              <w:t xml:space="preserve">el estudio individual durante la semana, llega al CIPAS sin nada que aportar y el trabajo en equipo se vuelve una molestia. La verdadera ventaja de esta modalidad está en la co-validación</w:t>
+            </w:r>
+            <w:r>
+              <w:rPr>
+                <w:rFonts w:ascii="Times New Roman" w:hAnsi="Times New Roman" w:eastAsia="Times New Roman" w:cs="Times New Roman"/>
+                <w:sz w:val="24"/>
+                <w:szCs w:val="24"/>
+                <w:lang w:val="es-ES"/>
+              </w:rPr>
+              <w:t xml:space="preserve">,</w:t>
+            </w:r>
+            <w:r>
+              <w:rPr>
+                <w:rFonts w:ascii="Times New Roman" w:hAnsi="Times New Roman" w:eastAsia="Times New Roman" w:cs="Times New Roman"/>
+                <w:sz w:val="24"/>
+                <w:szCs w:val="24"/>
+              </w:rPr>
+              <w:t xml:space="preserve"> poder </w:t>
+            </w:r>
+            <w:r>
+              <w:rPr>
+                <w:rFonts w:ascii="Times New Roman" w:hAnsi="Times New Roman" w:eastAsia="Times New Roman" w:cs="Times New Roman"/>
+                <w:sz w:val="24"/>
+                <w:szCs w:val="24"/>
+                <w:lang w:val="es-ES"/>
+              </w:rPr>
+              <w:t xml:space="preserve">mostrar</w:t>
+            </w:r>
+            <w:r>
+              <w:rPr>
+                <w:rFonts w:ascii="Times New Roman" w:hAnsi="Times New Roman" w:eastAsia="Times New Roman" w:cs="Times New Roman"/>
+                <w:sz w:val="24"/>
+                <w:szCs w:val="24"/>
+                <w:lang w:val="es-ES"/>
+              </w:rPr>
+              <w:t xml:space="preserve"> </w:t>
+            </w:r>
+            <w:r>
+              <w:rPr>
+                <w:rFonts w:ascii="Times New Roman" w:hAnsi="Times New Roman" w:eastAsia="Times New Roman" w:cs="Times New Roman"/>
+                <w:sz w:val="24"/>
+                <w:szCs w:val="24"/>
+              </w:rPr>
+              <w:t xml:space="preserve">mis apuntes con el criterio del grupo y del tutor </w:t>
+            </w:r>
+            <w:r>
+              <w:rPr>
+                <w:rFonts w:ascii="Times New Roman" w:hAnsi="Times New Roman" w:eastAsia="Times New Roman" w:cs="Times New Roman"/>
+                <w:sz w:val="24"/>
+                <w:szCs w:val="24"/>
+              </w:rPr>
+              <w:t xml:space="preserve">para saber si realmente estoy entendiendo. Además, me quedó claro que tener flexibilidad de horario no es tener tiempo libre para procrastinar, sino la responsabilidad de apartar bloques fijos en la semana para cumplir con las horas que exige cada crédito.</w:t>
+            </w:r>
+            <w:r>
+              <w:rPr>
+                <w:rFonts w:ascii="Times New Roman" w:hAnsi="Times New Roman" w:eastAsia="Times New Roman" w:cs="Times New Roman"/>
+                <w:sz w:val="24"/>
+                <w:szCs w:val="24"/>
+              </w:rPr>
             </w:r>
           </w:p>
         </w:tc>
@@ -671,40 +1536,152 @@
           </w:tcPr>
           <w:p>
             <w:pPr>
+              <w:pBdr/>
               <w:spacing w:after="60"/>
+              <w:ind/>
+              <w:rPr>
+                <w:rFonts w:ascii="Times New Roman" w:hAnsi="Times New Roman" w:cs="Times New Roman"/>
+                <w:sz w:val="24"/>
+                <w:szCs w:val="24"/>
+              </w:rPr>
             </w:pPr>
-            <w:r/>
             <w:r>
               <w:rPr>
-                <w:rFonts w:ascii="Arial" w:hAnsi="Arial"/>
+                <w:rFonts w:ascii="Times New Roman" w:hAnsi="Times New Roman" w:eastAsia="Times New Roman" w:cs="Times New Roman"/>
                 <w:b/>
-                <w:sz w:val="22"/>
+                <w:sz w:val="24"/>
+                <w:szCs w:val="24"/>
               </w:rPr>
-              <w:t>Discusiones y recomendaciones:</w:t>
+              <w:t xml:space="preserve">Discusiones y recomendaciones:</w:t>
+            </w:r>
+            <w:r>
+              <w:rPr>
+                <w:rFonts w:ascii="Times New Roman" w:hAnsi="Times New Roman" w:eastAsia="Times New Roman" w:cs="Times New Roman"/>
+                <w:sz w:val="24"/>
+                <w:szCs w:val="24"/>
+              </w:rPr>
             </w:r>
           </w:p>
           <w:p>
             <w:pPr>
+              <w:pBdr/>
               <w:spacing w:after="60" w:line="276" w:lineRule="auto"/>
+              <w:ind/>
+              <w:rPr>
+                <w:rFonts w:ascii="Times New Roman" w:hAnsi="Times New Roman" w:cs="Times New Roman"/>
+                <w:sz w:val="24"/>
+                <w:szCs w:val="24"/>
+              </w:rPr>
             </w:pPr>
             <w:r>
               <w:rPr>
-                <w:rFonts w:ascii="Arial" w:hAnsi="Arial"/>
-                <w:sz w:val="20"/>
+                <w:rFonts w:ascii="Times New Roman" w:hAnsi="Times New Roman" w:eastAsia="Times New Roman" w:cs="Times New Roman"/>
+                <w:sz w:val="24"/>
+                <w:szCs w:val="24"/>
               </w:rPr>
-              <w:t>En el día a día de los CIPAS, el error más repetido es el «reparto de pedazos»: asignarle un punto a cada quien y luego pegar todo al final como una colcha de retazos, sin que nadie revise lo que hizo el compañero. Esa costumbre rompe por completo el segundo momento del aprendizaje porque elimina el debate y la co-validación que plantea el módulo.</w:t>
+              <w:t xml:space="preserve">En el día a día de los CIPAS, el error más repetido es el </w:t>
+            </w:r>
+            <w:r>
+              <w:rPr>
+                <w:rFonts w:ascii="Times New Roman" w:hAnsi="Times New Roman" w:eastAsia="Times New Roman" w:cs="Times New Roman"/>
+                <w:sz w:val="24"/>
+                <w:szCs w:val="24"/>
+                <w:lang w:val="es-ES"/>
+              </w:rPr>
+              <w:t xml:space="preserve">“</w:t>
+            </w:r>
+            <w:r>
+              <w:rPr>
+                <w:rFonts w:ascii="Times New Roman" w:hAnsi="Times New Roman" w:eastAsia="Times New Roman" w:cs="Times New Roman"/>
+                <w:sz w:val="24"/>
+                <w:szCs w:val="24"/>
+              </w:rPr>
+              <w:t xml:space="preserve">reparto de pedazos</w:t>
+            </w:r>
+            <w:r>
+              <w:rPr>
+                <w:rFonts w:ascii="Times New Roman" w:hAnsi="Times New Roman" w:eastAsia="Times New Roman" w:cs="Times New Roman"/>
+                <w:sz w:val="24"/>
+                <w:szCs w:val="24"/>
+                <w:lang w:val="es-ES"/>
+              </w:rPr>
+              <w:t xml:space="preserve">”</w:t>
+            </w:r>
+            <w:r>
+              <w:rPr>
+                <w:rFonts w:ascii="Times New Roman" w:hAnsi="Times New Roman" w:eastAsia="Times New Roman" w:cs="Times New Roman"/>
+                <w:sz w:val="24"/>
+                <w:szCs w:val="24"/>
+              </w:rPr>
+              <w:t xml:space="preserve">: asignarle un </w:t>
+            </w:r>
+            <w:r>
+              <w:rPr>
+                <w:rFonts w:ascii="Times New Roman" w:hAnsi="Times New Roman" w:eastAsia="Times New Roman" w:cs="Times New Roman"/>
+                <w:sz w:val="24"/>
+                <w:szCs w:val="24"/>
+              </w:rPr>
+              <w:t xml:space="preserve">punto a cada quien y luego pegar todo al final como una colcha de retazos, sin que nadie revise lo que hizo el compañero. Esa costumbre rompe por completo el segundo momento del aprendizaje porque elimina el debate y la co-validación que plantea el módulo.</w:t>
+            </w:r>
+            <w:r>
+              <w:rPr>
+                <w:rFonts w:ascii="Times New Roman" w:hAnsi="Times New Roman" w:eastAsia="Times New Roman" w:cs="Times New Roman"/>
+                <w:sz w:val="24"/>
+                <w:szCs w:val="24"/>
+              </w:rPr>
             </w:r>
           </w:p>
           <w:p>
             <w:pPr>
+              <w:pBdr/>
               <w:spacing w:after="60" w:line="276" w:lineRule="auto"/>
+              <w:ind/>
+              <w:rPr>
+                <w:rFonts w:ascii="Times New Roman" w:hAnsi="Times New Roman" w:cs="Times New Roman"/>
+                <w:sz w:val="24"/>
+                <w:szCs w:val="24"/>
+              </w:rPr>
             </w:pPr>
             <w:r>
               <w:rPr>
-                <w:rFonts w:ascii="Arial" w:hAnsi="Arial"/>
-                <w:sz w:val="20"/>
+                <w:rFonts w:ascii="Times New Roman" w:hAnsi="Times New Roman" w:eastAsia="Times New Roman" w:cs="Times New Roman"/>
+                <w:sz w:val="24"/>
+                <w:szCs w:val="24"/>
               </w:rPr>
-              <w:t>Mi recomendación para evitar esto es fijar una regla clara en el equipo: nadie entra a armar el protocolo colaborativo si no tiene listo y compartido su protocolo individual. También sugiero que los acuerdos se hagan trabajando sobre un documento compartido en Google Docs o repositorio, revisando punto por punto para que el sábado lleguemos a la tutoría con dudas reales de fondo y no con un texto pegado a las carreras.</w:t>
+              <w:t xml:space="preserve">Mi recomendación para evitar esto es fijar una regla clara en el equipo</w:t>
+            </w:r>
+            <w:r>
+              <w:rPr>
+                <w:rFonts w:ascii="Times New Roman" w:hAnsi="Times New Roman" w:eastAsia="Times New Roman" w:cs="Times New Roman"/>
+                <w:sz w:val="24"/>
+                <w:szCs w:val="24"/>
+                <w:lang w:val="es-ES"/>
+              </w:rPr>
+              <w:t xml:space="preserve">,</w:t>
+            </w:r>
+            <w:r>
+              <w:rPr>
+                <w:rFonts w:ascii="Times New Roman" w:hAnsi="Times New Roman" w:eastAsia="Times New Roman" w:cs="Times New Roman"/>
+                <w:sz w:val="24"/>
+                <w:szCs w:val="24"/>
+              </w:rPr>
+              <w:t xml:space="preserve"> nadie entra a armar el protocolo colaborativo si</w:t>
+            </w:r>
+            <w:r>
+              <w:rPr>
+                <w:rFonts w:ascii="Times New Roman" w:hAnsi="Times New Roman" w:eastAsia="Times New Roman" w:cs="Times New Roman"/>
+                <w:sz w:val="24"/>
+                <w:szCs w:val="24"/>
+                <w:lang w:val="es-ES"/>
+              </w:rPr>
+              <w:t xml:space="preserve">n haber estudiado antes, y haber llenado su protocolo individual.</w:t>
+            </w:r>
+            <w:r>
+              <w:rPr>
+                <w:rFonts w:ascii="Times New Roman" w:hAnsi="Times New Roman" w:eastAsia="Times New Roman" w:cs="Times New Roman"/>
+                <w:sz w:val="24"/>
+                <w:szCs w:val="24"/>
+              </w:rPr>
             </w:r>
           </w:p>
         </w:tc>
@@ -719,108 +1696,183 @@
           </w:tcPr>
           <w:p>
             <w:pPr>
+              <w:pBdr/>
               <w:spacing w:after="60"/>
+              <w:ind/>
+              <w:rPr>
+                <w:rFonts w:ascii="Times New Roman" w:hAnsi="Times New Roman" w:cs="Times New Roman"/>
+                <w:sz w:val="24"/>
+                <w:szCs w:val="24"/>
+              </w:rPr>
             </w:pPr>
-            <w:r/>
             <w:r>
               <w:rPr>
-                <w:rFonts w:ascii="Arial" w:hAnsi="Arial"/>
+                <w:rFonts w:ascii="Times New Roman" w:hAnsi="Times New Roman" w:eastAsia="Times New Roman" w:cs="Times New Roman"/>
                 <w:b/>
-                <w:sz w:val="22"/>
+                <w:sz w:val="24"/>
+                <w:szCs w:val="24"/>
               </w:rPr>
-              <w:t>Bibliografía:</w:t>
+              <w:t xml:space="preserve">Bibliografía:</w:t>
+            </w:r>
+            <w:r>
+              <w:rPr>
+                <w:rFonts w:ascii="Times New Roman" w:hAnsi="Times New Roman" w:eastAsia="Times New Roman" w:cs="Times New Roman"/>
+                <w:sz w:val="24"/>
+                <w:szCs w:val="24"/>
+              </w:rPr>
             </w:r>
           </w:p>
           <w:p>
             <w:pPr>
+              <w:pBdr/>
               <w:spacing w:after="40"/>
               <w:ind w:left="216"/>
+              <w:rPr>
+                <w:rFonts w:ascii="Times New Roman" w:hAnsi="Times New Roman" w:cs="Times New Roman"/>
+                <w:sz w:val="24"/>
+                <w:szCs w:val="24"/>
+              </w:rPr>
             </w:pPr>
             <w:r>
               <w:rPr>
-                <w:rFonts w:ascii="Arial" w:hAnsi="Arial"/>
+                <w:rFonts w:ascii="Times New Roman" w:hAnsi="Times New Roman" w:eastAsia="Times New Roman" w:cs="Times New Roman"/>
                 <w:b/>
-                <w:sz w:val="20"/>
+                <w:sz w:val="24"/>
+                <w:szCs w:val="24"/>
               </w:rPr>
               <w:t xml:space="preserve">• </w:t>
             </w:r>
             <w:r>
               <w:rPr>
-                <w:rFonts w:ascii="Arial" w:hAnsi="Arial"/>
-                <w:sz w:val="20"/>
+                <w:rFonts w:ascii="Times New Roman" w:hAnsi="Times New Roman" w:eastAsia="Times New Roman" w:cs="Times New Roman"/>
+                <w:sz w:val="24"/>
+                <w:szCs w:val="24"/>
               </w:rPr>
-              <w:t>Lora Sfer, A. (2014). Los tres momentos del aprendizaje en la educación a distancia. Universidad de Cartagena.</w:t>
+              <w:t xml:space="preserve">Lora Sfer, A. (2014). Los tres momentos del aprendizaje en la educación a distancia. Universidad de Cartagena.</w:t>
+            </w:r>
+            <w:r>
+              <w:rPr>
+                <w:rFonts w:ascii="Times New Roman" w:hAnsi="Times New Roman" w:eastAsia="Times New Roman" w:cs="Times New Roman"/>
+                <w:sz w:val="24"/>
+                <w:szCs w:val="24"/>
+              </w:rPr>
             </w:r>
           </w:p>
           <w:p>
             <w:pPr>
+              <w:pBdr/>
               <w:spacing w:after="40"/>
               <w:ind w:left="216"/>
+              <w:rPr>
+                <w:rFonts w:ascii="Times New Roman" w:hAnsi="Times New Roman" w:cs="Times New Roman"/>
+                <w:sz w:val="24"/>
+                <w:szCs w:val="24"/>
+              </w:rPr>
             </w:pPr>
             <w:r>
               <w:rPr>
-                <w:rFonts w:ascii="Arial" w:hAnsi="Arial"/>
+                <w:rFonts w:ascii="Times New Roman" w:hAnsi="Times New Roman" w:eastAsia="Times New Roman" w:cs="Times New Roman"/>
                 <w:b/>
-                <w:sz w:val="20"/>
+                <w:sz w:val="24"/>
+                <w:szCs w:val="24"/>
               </w:rPr>
               <w:t xml:space="preserve">• </w:t>
             </w:r>
             <w:r>
               <w:rPr>
-                <w:rFonts w:ascii="Arial" w:hAnsi="Arial"/>
-                <w:sz w:val="20"/>
+                <w:rFonts w:ascii="Times New Roman" w:hAnsi="Times New Roman" w:eastAsia="Times New Roman" w:cs="Times New Roman"/>
+                <w:sz w:val="24"/>
+                <w:szCs w:val="24"/>
               </w:rPr>
-              <w:t>Bermúdez Mendieta, J. (2021). El aprendizaje basado en problemas para mejorar el pensamiento crítico. INNOVA Research Journal.</w:t>
+              <w:t xml:space="preserve">Bermúdez Mendieta, J. (2021). El aprendizaje basado en problemas para mejorar el pensamiento crítico. INNOVA Research Journal.</w:t>
+            </w:r>
+            <w:r>
+              <w:rPr>
+                <w:rFonts w:ascii="Times New Roman" w:hAnsi="Times New Roman" w:eastAsia="Times New Roman" w:cs="Times New Roman"/>
+                <w:sz w:val="24"/>
+                <w:szCs w:val="24"/>
+              </w:rPr>
             </w:r>
           </w:p>
           <w:p>
             <w:pPr>
+              <w:pBdr/>
               <w:spacing w:after="40"/>
               <w:ind w:left="216"/>
+              <w:rPr>
+                <w:rFonts w:ascii="Times New Roman" w:hAnsi="Times New Roman" w:cs="Times New Roman"/>
+                <w:sz w:val="24"/>
+                <w:szCs w:val="24"/>
+              </w:rPr>
             </w:pPr>
             <w:r>
               <w:rPr>
-                <w:rFonts w:ascii="Arial" w:hAnsi="Arial"/>
+                <w:rFonts w:ascii="Times New Roman" w:hAnsi="Times New Roman" w:eastAsia="Times New Roman" w:cs="Times New Roman"/>
                 <w:b/>
-                <w:sz w:val="20"/>
+                <w:sz w:val="24"/>
+                <w:szCs w:val="24"/>
               </w:rPr>
               <w:t xml:space="preserve">• </w:t>
             </w:r>
             <w:r>
               <w:rPr>
-                <w:rFonts w:ascii="Arial" w:hAnsi="Arial"/>
-                <w:sz w:val="20"/>
+                <w:rFonts w:ascii="Times New Roman" w:hAnsi="Times New Roman" w:eastAsia="Times New Roman" w:cs="Times New Roman"/>
+                <w:sz w:val="24"/>
+                <w:szCs w:val="24"/>
               </w:rPr>
-              <w:t>Costa Román, Ó., &amp; García Gaitero, O. (2017). El aprendizaje autorregulado y las estrategias de aprendizaje. Tendencias Pedagógicas.</w:t>
+              <w:t xml:space="preserve">Costa Román, Ó., &amp; García Gaitero, O. (2017). El aprendizaje autorregulado y las estrategias de aprendizaje. Tendencias Pedagógicas.</w:t>
+            </w:r>
+            <w:r>
+              <w:rPr>
+                <w:rFonts w:ascii="Times New Roman" w:hAnsi="Times New Roman" w:eastAsia="Times New Roman" w:cs="Times New Roman"/>
+                <w:sz w:val="24"/>
+                <w:szCs w:val="24"/>
+              </w:rPr>
             </w:r>
           </w:p>
           <w:p>
             <w:pPr>
+              <w:pBdr/>
               <w:spacing w:after="40"/>
               <w:ind w:left="216"/>
+              <w:rPr>
+                <w:rFonts w:ascii="Times New Roman" w:hAnsi="Times New Roman" w:cs="Times New Roman"/>
+                <w:sz w:val="24"/>
+                <w:szCs w:val="24"/>
+              </w:rPr>
             </w:pPr>
             <w:r>
               <w:rPr>
-                <w:rFonts w:ascii="Arial" w:hAnsi="Arial"/>
+                <w:rFonts w:ascii="Times New Roman" w:hAnsi="Times New Roman" w:eastAsia="Times New Roman" w:cs="Times New Roman"/>
                 <w:b/>
-                <w:sz w:val="20"/>
+                <w:sz w:val="24"/>
+                <w:szCs w:val="24"/>
               </w:rPr>
               <w:t xml:space="preserve">• </w:t>
             </w:r>
             <w:r>
               <w:rPr>
-                <w:rFonts w:ascii="Arial" w:hAnsi="Arial"/>
+                <w:rFonts w:ascii="Times New Roman" w:hAnsi="Times New Roman" w:eastAsia="Times New Roman" w:cs="Times New Roman"/>
                 <w:b/>
-                <w:sz w:val="20"/>
+                <w:sz w:val="24"/>
+                <w:szCs w:val="24"/>
               </w:rPr>
-              <w:t>Universidad de Cartagena - CTEV. (2026). Módulo Unidad 2:</w:t>
+              <w:t xml:space="preserve">Universidad de Cartagena - CTEV. (2026). Módulo Unidad 2:</w:t>
             </w:r>
             <w:r>
               <w:rPr>
-                <w:rFonts w:ascii="Arial" w:hAnsi="Arial"/>
-                <w:sz w:val="20"/>
+                <w:rFonts w:ascii="Times New Roman" w:hAnsi="Times New Roman" w:eastAsia="Times New Roman" w:cs="Times New Roman"/>
+                <w:sz w:val="24"/>
+                <w:szCs w:val="24"/>
               </w:rPr>
               <w:t xml:space="preserve"> Momentos de Aprendizaje Metodología a Distancia. Centro de Tecnologías para la Educación Virtual. Cartagena, Colombia.</w:t>
+            </w:r>
+            <w:r>
+              <w:rPr>
+                <w:rFonts w:ascii="Times New Roman" w:hAnsi="Times New Roman" w:eastAsia="Times New Roman" w:cs="Times New Roman"/>
+                <w:sz w:val="24"/>
+                <w:szCs w:val="24"/>
+              </w:rPr>
             </w:r>
           </w:p>
         </w:tc>

</xml_diff>